<commit_message>
Updated quiz and other features
</commit_message>
<xml_diff>
--- a/Documentation/6.Project Testing/Performance Testing.docx
+++ b/Documentation/6.Project Testing/Performance Testing.docx
@@ -44,7 +44,6 @@
         <w:tblCellMar>
           <w:top w:w="134" w:type="dxa"/>
           <w:left w:w="135" w:type="dxa"/>
-          <w:bottom w:w="0" w:type="dxa"/>
           <w:right w:w="115" w:type="dxa"/>
         </w:tblCellMar>
         <w:tblLook w:val="04A0" w:firstRow="1" w:lastRow="0" w:firstColumn="1" w:lastColumn="0" w:noHBand="0" w:noVBand="1"/>
@@ -69,7 +68,6 @@
           </w:tcPr>
           <w:p>
             <w:pPr>
-              <w:spacing w:after="0"/>
               <w:rPr>
                 <w:rFonts w:ascii="Times New Roman" w:hAnsi="Times New Roman" w:cs="Times New Roman"/>
                 <w:sz w:val="24"/>
@@ -83,62 +81,44 @@
                 <w:sz w:val="24"/>
                 <w:szCs w:val="24"/>
               </w:rPr>
-              <w:t>Date</w:t>
-            </w:r>
-            <w:r>
-              <w:rPr>
-                <w:rFonts w:ascii="Times New Roman" w:eastAsia="Arial" w:hAnsi="Times New Roman" w:cs="Times New Roman"/>
-                <w:b/>
+              <w:t xml:space="preserve">Date </w:t>
+            </w:r>
+          </w:p>
+        </w:tc>
+        <w:tc>
+          <w:tcPr>
+            <w:tcW w:w="7202" w:type="dxa"/>
+            <w:tcBorders>
+              <w:top w:val="single" w:sz="8" w:space="0" w:color="000000"/>
+              <w:left w:val="single" w:sz="8" w:space="0" w:color="000000"/>
+              <w:bottom w:val="single" w:sz="8" w:space="0" w:color="000000"/>
+              <w:right w:val="single" w:sz="8" w:space="0" w:color="000000"/>
+            </w:tcBorders>
+          </w:tcPr>
+          <w:p>
+            <w:pPr>
+              <w:ind w:left="14"/>
+              <w:rPr>
+                <w:rFonts w:ascii="Times New Roman" w:hAnsi="Times New Roman" w:cs="Times New Roman"/>
                 <w:sz w:val="24"/>
                 <w:szCs w:val="24"/>
               </w:rPr>
-              <w:t xml:space="preserve"> </w:t>
-            </w:r>
-          </w:p>
-        </w:tc>
-        <w:tc>
-          <w:tcPr>
-            <w:tcW w:w="7202" w:type="dxa"/>
-            <w:tcBorders>
-              <w:top w:val="single" w:sz="8" w:space="0" w:color="000000"/>
-              <w:left w:val="single" w:sz="8" w:space="0" w:color="000000"/>
-              <w:bottom w:val="single" w:sz="8" w:space="0" w:color="000000"/>
-              <w:right w:val="single" w:sz="8" w:space="0" w:color="000000"/>
-            </w:tcBorders>
-          </w:tcPr>
-          <w:p>
-            <w:pPr>
-              <w:spacing w:after="0"/>
-              <w:ind w:left="14"/>
-              <w:rPr>
-                <w:rFonts w:ascii="Times New Roman" w:hAnsi="Times New Roman" w:cs="Times New Roman"/>
+            </w:pPr>
+            <w:r>
+              <w:rPr>
+                <w:rFonts w:ascii="Times New Roman" w:eastAsia="Arial" w:hAnsi="Times New Roman" w:cs="Times New Roman"/>
                 <w:sz w:val="24"/>
                 <w:szCs w:val="24"/>
               </w:rPr>
-            </w:pPr>
+              <w:t>2 JULY</w:t>
+            </w:r>
             <w:r>
               <w:rPr>
                 <w:rFonts w:ascii="Times New Roman" w:eastAsia="Arial" w:hAnsi="Times New Roman" w:cs="Times New Roman"/>
                 <w:sz w:val="24"/>
                 <w:szCs w:val="24"/>
               </w:rPr>
-              <w:t>2 JULY</w:t>
-            </w:r>
-            <w:r>
-              <w:rPr>
-                <w:rFonts w:ascii="Times New Roman" w:eastAsia="Arial" w:hAnsi="Times New Roman" w:cs="Times New Roman"/>
-                <w:sz w:val="24"/>
-                <w:szCs w:val="24"/>
-              </w:rPr>
-              <w:t xml:space="preserve"> 2026</w:t>
-            </w:r>
-            <w:r>
-              <w:rPr>
-                <w:rFonts w:ascii="Times New Roman" w:eastAsia="Arial" w:hAnsi="Times New Roman" w:cs="Times New Roman"/>
-                <w:sz w:val="24"/>
-                <w:szCs w:val="24"/>
-              </w:rPr>
-              <w:t xml:space="preserve"> </w:t>
+              <w:t xml:space="preserve"> 2026 </w:t>
             </w:r>
           </w:p>
         </w:tc>
@@ -159,7 +139,6 @@
           </w:tcPr>
           <w:p>
             <w:pPr>
-              <w:spacing w:after="0"/>
               <w:rPr>
                 <w:rFonts w:ascii="Times New Roman" w:hAnsi="Times New Roman" w:cs="Times New Roman"/>
                 <w:sz w:val="24"/>
@@ -173,16 +152,7 @@
                 <w:sz w:val="24"/>
                 <w:szCs w:val="24"/>
               </w:rPr>
-              <w:t>Team ID</w:t>
-            </w:r>
-            <w:r>
-              <w:rPr>
-                <w:rFonts w:ascii="Times New Roman" w:eastAsia="Arial" w:hAnsi="Times New Roman" w:cs="Times New Roman"/>
-                <w:b/>
-                <w:sz w:val="24"/>
-                <w:szCs w:val="24"/>
-              </w:rPr>
-              <w:t xml:space="preserve"> </w:t>
+              <w:t xml:space="preserve">Team ID </w:t>
             </w:r>
           </w:p>
         </w:tc>
@@ -198,7 +168,6 @@
           </w:tcPr>
           <w:p>
             <w:pPr>
-              <w:spacing w:after="0"/>
               <w:ind w:left="14"/>
               <w:rPr>
                 <w:rFonts w:ascii="Times New Roman" w:hAnsi="Times New Roman" w:cs="Times New Roman"/>
@@ -233,7 +202,6 @@
           </w:tcPr>
           <w:p>
             <w:pPr>
-              <w:spacing w:after="0"/>
               <w:rPr>
                 <w:rFonts w:ascii="Times New Roman" w:hAnsi="Times New Roman" w:cs="Times New Roman"/>
                 <w:sz w:val="24"/>
@@ -247,16 +215,7 @@
                 <w:sz w:val="24"/>
                 <w:szCs w:val="24"/>
               </w:rPr>
-              <w:t>Project Name</w:t>
-            </w:r>
-            <w:r>
-              <w:rPr>
-                <w:rFonts w:ascii="Times New Roman" w:eastAsia="Arial" w:hAnsi="Times New Roman" w:cs="Times New Roman"/>
-                <w:b/>
-                <w:sz w:val="24"/>
-                <w:szCs w:val="24"/>
-              </w:rPr>
-              <w:t xml:space="preserve"> </w:t>
+              <w:t xml:space="preserve">Project Name </w:t>
             </w:r>
           </w:p>
         </w:tc>
@@ -272,7 +231,6 @@
           </w:tcPr>
           <w:p>
             <w:pPr>
-              <w:spacing w:after="0"/>
               <w:ind w:left="14"/>
               <w:rPr>
                 <w:rFonts w:ascii="Times New Roman" w:hAnsi="Times New Roman" w:cs="Times New Roman"/>
@@ -318,7 +276,6 @@
           </w:tcPr>
           <w:p>
             <w:pPr>
-              <w:spacing w:after="0"/>
               <w:rPr>
                 <w:rFonts w:ascii="Times New Roman" w:hAnsi="Times New Roman" w:cs="Times New Roman"/>
                 <w:sz w:val="24"/>
@@ -349,7 +306,6 @@
           </w:tcPr>
           <w:p>
             <w:pPr>
-              <w:spacing w:after="0"/>
               <w:ind w:left="14"/>
               <w:rPr>
                 <w:rFonts w:ascii="Times New Roman" w:hAnsi="Times New Roman" w:cs="Times New Roman"/>
@@ -411,19 +367,17 @@
         <w:ind w:left="10" w:right="738" w:hanging="10"/>
         <w:rPr>
           <w:rFonts w:ascii="Times New Roman" w:hAnsi="Times New Roman" w:cs="Times New Roman"/>
+          <w:sz w:val="24"/>
+          <w:szCs w:val="24"/>
         </w:rPr>
       </w:pPr>
       <w:r>
         <w:rPr>
           <w:rFonts w:ascii="Times New Roman" w:eastAsia="Arial" w:hAnsi="Times New Roman" w:cs="Times New Roman"/>
-        </w:rPr>
-        <w:t xml:space="preserve">Performance testing evaluates how your system behaves under expected and peak load </w:t>
-      </w:r>
-      <w:r>
-        <w:rPr>
-          <w:rFonts w:ascii="Times New Roman" w:eastAsia="Arial" w:hAnsi="Times New Roman" w:cs="Times New Roman"/>
-        </w:rPr>
-        <w:t xml:space="preserve">conditions. Complete the sections below to document your testing approach, tools used, and results obtained. </w:t>
+          <w:sz w:val="24"/>
+          <w:szCs w:val="24"/>
+        </w:rPr>
+        <w:t xml:space="preserve">Performance testing evaluates how your system behaves under expected and peak load conditions. Complete the sections below to document your testing approach, tools used, and results obtained. </w:t>
       </w:r>
     </w:p>
     <w:p>
@@ -483,7 +437,6 @@
         <w:tblW w:w="9362" w:type="dxa"/>
         <w:tblInd w:w="0" w:type="dxa"/>
         <w:tblCellMar>
-          <w:top w:w="0" w:type="dxa"/>
           <w:left w:w="10" w:type="dxa"/>
           <w:bottom w:w="42" w:type="dxa"/>
           <w:right w:w="115" w:type="dxa"/>
@@ -511,7 +464,6 @@
           </w:tcPr>
           <w:p>
             <w:pPr>
-              <w:spacing w:after="0"/>
               <w:ind w:left="151"/>
               <w:rPr>
                 <w:rFonts w:ascii="Times New Roman" w:hAnsi="Times New Roman" w:cs="Times New Roman"/>
@@ -522,49 +474,34 @@
                 <w:rFonts w:ascii="Times New Roman" w:eastAsia="Arial" w:hAnsi="Times New Roman" w:cs="Times New Roman"/>
                 <w:b/>
               </w:rPr>
-              <w:t>Field</w:t>
-            </w:r>
+              <w:t xml:space="preserve">Field </w:t>
+            </w:r>
+          </w:p>
+        </w:tc>
+        <w:tc>
+          <w:tcPr>
+            <w:tcW w:w="6241" w:type="dxa"/>
+            <w:tcBorders>
+              <w:top w:val="single" w:sz="8" w:space="0" w:color="000000"/>
+              <w:left w:val="single" w:sz="8" w:space="0" w:color="000000"/>
+              <w:bottom w:val="single" w:sz="8" w:space="0" w:color="000000"/>
+              <w:right w:val="single" w:sz="8" w:space="0" w:color="000000"/>
+            </w:tcBorders>
+            <w:vAlign w:val="center"/>
+          </w:tcPr>
+          <w:p>
+            <w:pPr>
+              <w:ind w:left="139"/>
+              <w:rPr>
+                <w:rFonts w:ascii="Times New Roman" w:hAnsi="Times New Roman" w:cs="Times New Roman"/>
+              </w:rPr>
+            </w:pPr>
             <w:r>
               <w:rPr>
                 <w:rFonts w:ascii="Times New Roman" w:eastAsia="Arial" w:hAnsi="Times New Roman" w:cs="Times New Roman"/>
                 <w:b/>
               </w:rPr>
-              <w:t xml:space="preserve"> </w:t>
-            </w:r>
-          </w:p>
-        </w:tc>
-        <w:tc>
-          <w:tcPr>
-            <w:tcW w:w="6241" w:type="dxa"/>
-            <w:tcBorders>
-              <w:top w:val="single" w:sz="8" w:space="0" w:color="000000"/>
-              <w:left w:val="single" w:sz="8" w:space="0" w:color="000000"/>
-              <w:bottom w:val="single" w:sz="8" w:space="0" w:color="000000"/>
-              <w:right w:val="single" w:sz="8" w:space="0" w:color="000000"/>
-            </w:tcBorders>
-            <w:vAlign w:val="center"/>
-          </w:tcPr>
-          <w:p>
-            <w:pPr>
-              <w:spacing w:after="0"/>
-              <w:ind w:left="139"/>
-              <w:rPr>
-                <w:rFonts w:ascii="Times New Roman" w:hAnsi="Times New Roman" w:cs="Times New Roman"/>
-              </w:rPr>
-            </w:pPr>
-            <w:r>
-              <w:rPr>
-                <w:rFonts w:ascii="Times New Roman" w:eastAsia="Arial" w:hAnsi="Times New Roman" w:cs="Times New Roman"/>
-                <w:b/>
-              </w:rPr>
-              <w:t>Details</w:t>
-            </w:r>
-            <w:r>
-              <w:rPr>
-                <w:rFonts w:ascii="Times New Roman" w:eastAsia="Arial" w:hAnsi="Times New Roman" w:cs="Times New Roman"/>
-                <w:b/>
-              </w:rPr>
-              <w:t xml:space="preserve"> </w:t>
+              <w:t xml:space="preserve">Details </w:t>
             </w:r>
           </w:p>
         </w:tc>
@@ -586,7 +523,6 @@
           </w:tcPr>
           <w:p>
             <w:pPr>
-              <w:spacing w:after="0"/>
               <w:ind w:left="125"/>
               <w:rPr>
                 <w:rFonts w:ascii="Times New Roman" w:hAnsi="Times New Roman" w:cs="Times New Roman"/>
@@ -620,7 +556,6 @@
           </w:tcPr>
           <w:p>
             <w:pPr>
-              <w:spacing w:after="0"/>
               <w:ind w:left="125"/>
               <w:rPr>
                 <w:rFonts w:ascii="Times New Roman" w:hAnsi="Times New Roman" w:cs="Times New Roman"/>
@@ -631,12 +566,6 @@
                 <w:rFonts w:ascii="Times New Roman" w:eastAsia="Arial" w:hAnsi="Times New Roman" w:cs="Times New Roman"/>
               </w:rPr>
               <w:t>Postman</w:t>
-            </w:r>
-            <w:r>
-              <w:rPr>
-                <w:rFonts w:ascii="Times New Roman" w:eastAsia="Arial" w:hAnsi="Times New Roman" w:cs="Times New Roman"/>
-              </w:rPr>
-              <w:t xml:space="preserve"> </w:t>
             </w:r>
           </w:p>
         </w:tc>
@@ -658,7 +587,6 @@
           </w:tcPr>
           <w:p>
             <w:pPr>
-              <w:spacing w:after="0"/>
               <w:ind w:left="125"/>
               <w:rPr>
                 <w:rFonts w:ascii="Times New Roman" w:hAnsi="Times New Roman" w:cs="Times New Roman"/>
@@ -692,7 +620,6 @@
           </w:tcPr>
           <w:p>
             <w:pPr>
-              <w:spacing w:after="0"/>
               <w:ind w:left="125"/>
               <w:rPr>
                 <w:rFonts w:ascii="Times New Roman" w:hAnsi="Times New Roman" w:cs="Times New Roman"/>
@@ -702,13 +629,7 @@
               <w:rPr>
                 <w:rFonts w:ascii="Times New Roman" w:eastAsia="Arial" w:hAnsi="Times New Roman" w:cs="Times New Roman"/>
               </w:rPr>
-              <w:t>Load Testing, Stress Testing</w:t>
-            </w:r>
-            <w:r>
-              <w:rPr>
-                <w:rFonts w:ascii="Times New Roman" w:eastAsia="Arial" w:hAnsi="Times New Roman" w:cs="Times New Roman"/>
-              </w:rPr>
-              <w:t xml:space="preserve"> </w:t>
+              <w:t xml:space="preserve">Load Testing, Stress Testing </w:t>
             </w:r>
           </w:p>
         </w:tc>
@@ -730,7 +651,6 @@
           </w:tcPr>
           <w:p>
             <w:pPr>
-              <w:spacing w:after="0"/>
               <w:ind w:left="125"/>
               <w:rPr>
                 <w:rFonts w:ascii="Times New Roman" w:hAnsi="Times New Roman" w:cs="Times New Roman"/>
@@ -764,7 +684,6 @@
           </w:tcPr>
           <w:p>
             <w:pPr>
-              <w:spacing w:after="0"/>
               <w:ind w:left="125"/>
               <w:rPr>
                 <w:rFonts w:ascii="Times New Roman" w:hAnsi="Times New Roman" w:cs="Times New Roman"/>
@@ -846,7 +765,6 @@
           </w:tcPr>
           <w:p>
             <w:pPr>
-              <w:spacing w:after="0"/>
               <w:ind w:left="125"/>
               <w:rPr>
                 <w:rFonts w:ascii="Times New Roman" w:hAnsi="Times New Roman" w:cs="Times New Roman"/>
@@ -880,7 +798,6 @@
           </w:tcPr>
           <w:p>
             <w:pPr>
-              <w:spacing w:after="0"/>
               <w:ind w:left="125"/>
               <w:rPr>
                 <w:rFonts w:ascii="Times New Roman" w:hAnsi="Times New Roman" w:cs="Times New Roman"/>
@@ -951,7 +868,6 @@
           </w:tcPr>
           <w:p>
             <w:pPr>
-              <w:spacing w:after="0"/>
               <w:ind w:left="125"/>
               <w:rPr>
                 <w:rFonts w:ascii="Times New Roman" w:hAnsi="Times New Roman" w:cs="Times New Roman"/>
@@ -985,7 +901,6 @@
           </w:tcPr>
           <w:p>
             <w:pPr>
-              <w:spacing w:after="0"/>
               <w:rPr>
                 <w:rFonts w:ascii="Times New Roman" w:hAnsi="Times New Roman" w:cs="Times New Roman"/>
               </w:rPr>
@@ -1079,7 +994,6 @@
           <w:top w:w="55" w:type="dxa"/>
           <w:left w:w="24" w:type="dxa"/>
           <w:bottom w:w="11" w:type="dxa"/>
-          <w:right w:w="0" w:type="dxa"/>
         </w:tblCellMar>
         <w:tblLook w:val="04A0" w:firstRow="1" w:lastRow="0" w:firstColumn="1" w:lastColumn="0" w:noHBand="0" w:noVBand="1"/>
       </w:tblPr>
@@ -1107,7 +1021,6 @@
           </w:tcPr>
           <w:p>
             <w:pPr>
-              <w:spacing w:after="0"/>
               <w:ind w:left="161"/>
               <w:rPr>
                 <w:rFonts w:ascii="Times New Roman" w:hAnsi="Times New Roman" w:cs="Times New Roman"/>
@@ -1169,7 +1082,6 @@
           </w:p>
           <w:p>
             <w:pPr>
-              <w:spacing w:after="0"/>
               <w:ind w:left="156"/>
               <w:rPr>
                 <w:rFonts w:ascii="Times New Roman" w:hAnsi="Times New Roman" w:cs="Times New Roman"/>
@@ -1213,7 +1125,6 @@
           </w:p>
           <w:p>
             <w:pPr>
-              <w:spacing w:after="0"/>
               <w:ind w:left="833"/>
               <w:rPr>
                 <w:rFonts w:ascii="Times New Roman" w:hAnsi="Times New Roman" w:cs="Times New Roman"/>
@@ -1241,7 +1152,6 @@
           </w:tcPr>
           <w:p>
             <w:pPr>
-              <w:spacing w:after="0"/>
               <w:ind w:right="45"/>
               <w:rPr>
                 <w:rFonts w:ascii="Times New Roman" w:hAnsi="Times New Roman" w:cs="Times New Roman"/>
@@ -1269,7 +1179,6 @@
           </w:tcPr>
           <w:p>
             <w:pPr>
-              <w:spacing w:after="0"/>
               <w:ind w:right="44"/>
               <w:rPr>
                 <w:rFonts w:ascii="Times New Roman" w:hAnsi="Times New Roman" w:cs="Times New Roman"/>
@@ -1302,7 +1211,6 @@
           </w:tcPr>
           <w:p>
             <w:pPr>
-              <w:spacing w:after="0"/>
               <w:ind w:left="8"/>
               <w:rPr>
                 <w:rFonts w:ascii="Times New Roman" w:hAnsi="Times New Roman" w:cs="Times New Roman"/>
@@ -1329,7 +1237,6 @@
           </w:tcPr>
           <w:p>
             <w:pPr>
-              <w:spacing w:after="0"/>
               <w:rPr>
                 <w:rFonts w:ascii="Times New Roman" w:hAnsi="Times New Roman" w:cs="Times New Roman"/>
               </w:rPr>
@@ -1357,7 +1264,6 @@
           </w:tcPr>
           <w:p>
             <w:pPr>
-              <w:spacing w:after="0"/>
               <w:ind w:right="26"/>
               <w:rPr>
                 <w:rFonts w:ascii="Times New Roman" w:hAnsi="Times New Roman" w:cs="Times New Roman"/>
@@ -1384,7 +1290,6 @@
           </w:tcPr>
           <w:p>
             <w:pPr>
-              <w:spacing w:after="0"/>
               <w:ind w:right="28"/>
               <w:rPr>
                 <w:rFonts w:ascii="Times New Roman" w:hAnsi="Times New Roman" w:cs="Times New Roman"/>
@@ -1411,7 +1316,6 @@
           </w:tcPr>
           <w:p>
             <w:pPr>
-              <w:spacing w:after="0"/>
               <w:rPr>
                 <w:rFonts w:ascii="Times New Roman" w:hAnsi="Times New Roman" w:cs="Times New Roman"/>
               </w:rPr>
@@ -1450,7 +1354,6 @@
           </w:tcPr>
           <w:p>
             <w:pPr>
-              <w:spacing w:after="0"/>
               <w:ind w:left="8"/>
               <w:rPr>
                 <w:rFonts w:ascii="Times New Roman" w:hAnsi="Times New Roman" w:cs="Times New Roman"/>
@@ -1477,7 +1380,6 @@
           </w:tcPr>
           <w:p>
             <w:pPr>
-              <w:spacing w:after="0"/>
               <w:rPr>
                 <w:rFonts w:ascii="Times New Roman" w:hAnsi="Times New Roman" w:cs="Times New Roman"/>
               </w:rPr>
@@ -1513,7 +1415,6 @@
           </w:tcPr>
           <w:p>
             <w:pPr>
-              <w:spacing w:after="0"/>
               <w:ind w:right="26"/>
               <w:rPr>
                 <w:rFonts w:ascii="Times New Roman" w:hAnsi="Times New Roman" w:cs="Times New Roman"/>
@@ -1540,7 +1441,6 @@
           </w:tcPr>
           <w:p>
             <w:pPr>
-              <w:spacing w:after="0"/>
               <w:ind w:right="28"/>
               <w:rPr>
                 <w:rFonts w:ascii="Times New Roman" w:hAnsi="Times New Roman" w:cs="Times New Roman"/>
@@ -1567,7 +1467,6 @@
           </w:tcPr>
           <w:p>
             <w:pPr>
-              <w:spacing w:after="0"/>
               <w:rPr>
                 <w:rFonts w:ascii="Times New Roman" w:hAnsi="Times New Roman" w:cs="Times New Roman"/>
               </w:rPr>
@@ -1598,7 +1497,6 @@
           </w:tcPr>
           <w:p>
             <w:pPr>
-              <w:spacing w:after="0"/>
               <w:ind w:left="8"/>
               <w:rPr>
                 <w:rFonts w:ascii="Times New Roman" w:hAnsi="Times New Roman" w:cs="Times New Roman"/>
@@ -1628,7 +1526,6 @@
               <w:tabs>
                 <w:tab w:val="left" w:pos="326"/>
               </w:tabs>
-              <w:spacing w:after="0"/>
               <w:rPr>
                 <w:rFonts w:ascii="Times New Roman" w:hAnsi="Times New Roman" w:cs="Times New Roman"/>
               </w:rPr>
@@ -1656,7 +1553,6 @@
           </w:tcPr>
           <w:p>
             <w:pPr>
-              <w:spacing w:after="0"/>
               <w:ind w:right="26"/>
               <w:rPr>
                 <w:rFonts w:ascii="Times New Roman" w:hAnsi="Times New Roman" w:cs="Times New Roman"/>
@@ -1683,7 +1579,6 @@
           </w:tcPr>
           <w:p>
             <w:pPr>
-              <w:spacing w:after="0"/>
               <w:ind w:right="26"/>
               <w:rPr>
                 <w:rFonts w:ascii="Times New Roman" w:hAnsi="Times New Roman" w:cs="Times New Roman"/>
@@ -1710,7 +1605,6 @@
           </w:tcPr>
           <w:p>
             <w:pPr>
-              <w:spacing w:after="0"/>
               <w:rPr>
                 <w:rFonts w:ascii="Times New Roman" w:hAnsi="Times New Roman" w:cs="Times New Roman"/>
               </w:rPr>
@@ -1741,7 +1635,6 @@
           </w:tcPr>
           <w:p>
             <w:pPr>
-              <w:spacing w:after="0"/>
               <w:ind w:left="8"/>
               <w:rPr>
                 <w:rFonts w:ascii="Times New Roman" w:hAnsi="Times New Roman" w:cs="Times New Roman"/>
@@ -1751,7 +1644,6 @@
               <w:rPr>
                 <w:rFonts w:ascii="Times New Roman" w:eastAsia="Arial" w:hAnsi="Times New Roman" w:cs="Times New Roman"/>
               </w:rPr>
-              <w:lastRenderedPageBreak/>
               <w:t>4</w:t>
             </w:r>
           </w:p>
@@ -1773,7 +1665,6 @@
                 <w:tab w:val="left" w:pos="701"/>
                 <w:tab w:val="center" w:pos="1296"/>
               </w:tabs>
-              <w:spacing w:after="0"/>
               <w:ind w:right="25"/>
               <w:rPr>
                 <w:rFonts w:ascii="Times New Roman" w:hAnsi="Times New Roman" w:cs="Times New Roman"/>
@@ -1802,7 +1693,6 @@
           </w:tcPr>
           <w:p>
             <w:pPr>
-              <w:spacing w:after="0"/>
               <w:ind w:right="26"/>
               <w:rPr>
                 <w:rFonts w:ascii="Times New Roman" w:hAnsi="Times New Roman" w:cs="Times New Roman"/>
@@ -1829,7 +1719,6 @@
           </w:tcPr>
           <w:p>
             <w:pPr>
-              <w:spacing w:after="0"/>
               <w:ind w:right="26"/>
               <w:rPr>
                 <w:rFonts w:ascii="Times New Roman" w:hAnsi="Times New Roman" w:cs="Times New Roman"/>
@@ -1856,7 +1745,6 @@
           </w:tcPr>
           <w:p>
             <w:pPr>
-              <w:spacing w:after="0"/>
               <w:rPr>
                 <w:rFonts w:ascii="Times New Roman" w:hAnsi="Times New Roman" w:cs="Times New Roman"/>
               </w:rPr>
@@ -1926,9 +1814,7 @@
         <w:tblInd w:w="0" w:type="dxa"/>
         <w:tblCellMar>
           <w:top w:w="122" w:type="dxa"/>
-          <w:left w:w="0" w:type="dxa"/>
           <w:bottom w:w="42" w:type="dxa"/>
-          <w:right w:w="0" w:type="dxa"/>
         </w:tblCellMar>
         <w:tblLook w:val="04A0" w:firstRow="1" w:lastRow="0" w:firstColumn="1" w:lastColumn="0" w:noHBand="0" w:noVBand="1"/>
       </w:tblPr>
@@ -1957,13 +1843,13 @@
           </w:tcPr>
           <w:p>
             <w:pPr>
-              <w:spacing w:after="0"/>
               <w:ind w:left="176"/>
               <w:jc w:val="center"/>
               <w:rPr>
                 <w:rFonts w:ascii="Times New Roman" w:hAnsi="Times New Roman" w:cs="Times New Roman"/>
               </w:rPr>
             </w:pPr>
+            <w:bookmarkStart w:id="0" w:name="_GoBack"/>
             <w:proofErr w:type="spellStart"/>
             <w:r>
               <w:rPr>
@@ -1988,7 +1874,6 @@
           </w:tcPr>
           <w:p>
             <w:pPr>
-              <w:spacing w:after="0"/>
               <w:ind w:left="53"/>
               <w:jc w:val="center"/>
               <w:rPr>
@@ -2017,7 +1902,6 @@
           </w:tcPr>
           <w:p>
             <w:pPr>
-              <w:spacing w:after="0"/>
               <w:ind w:right="43"/>
               <w:jc w:val="center"/>
               <w:rPr>
@@ -2046,7 +1930,6 @@
           </w:tcPr>
           <w:p>
             <w:pPr>
-              <w:spacing w:after="0"/>
               <w:ind w:left="194"/>
               <w:jc w:val="center"/>
               <w:rPr>
@@ -2075,7 +1958,6 @@
           </w:tcPr>
           <w:p>
             <w:pPr>
-              <w:spacing w:after="0"/>
               <w:ind w:left="39"/>
               <w:jc w:val="center"/>
               <w:rPr>
@@ -2087,14 +1969,7 @@
                 <w:rFonts w:ascii="Times New Roman" w:eastAsia="Arial" w:hAnsi="Times New Roman" w:cs="Times New Roman"/>
                 <w:b/>
               </w:rPr>
-              <w:t>Status (Pass /</w:t>
-            </w:r>
-            <w:r>
-              <w:rPr>
-                <w:rFonts w:ascii="Times New Roman" w:eastAsia="Arial" w:hAnsi="Times New Roman" w:cs="Times New Roman"/>
-                <w:b/>
-              </w:rPr>
-              <w:t>Fail)</w:t>
+              <w:t>Status (Pass /Fail)</w:t>
             </w:r>
           </w:p>
         </w:tc>
@@ -2111,7 +1986,6 @@
           </w:tcPr>
           <w:p>
             <w:pPr>
-              <w:spacing w:after="0"/>
               <w:ind w:right="177"/>
               <w:jc w:val="center"/>
               <w:rPr>
@@ -2145,7 +2019,6 @@
           </w:tcPr>
           <w:p>
             <w:pPr>
-              <w:spacing w:after="0"/>
               <w:ind w:left="54"/>
               <w:jc w:val="center"/>
               <w:rPr>
@@ -2173,7 +2046,6 @@
           </w:tcPr>
           <w:p>
             <w:pPr>
-              <w:spacing w:after="0"/>
               <w:ind w:left="165" w:right="104"/>
               <w:jc w:val="center"/>
               <w:rPr>
@@ -2215,7 +2087,6 @@
           </w:tcPr>
           <w:p>
             <w:pPr>
-              <w:spacing w:after="0"/>
               <w:ind w:right="144"/>
               <w:jc w:val="center"/>
               <w:rPr>
@@ -2243,7 +2114,6 @@
           </w:tcPr>
           <w:p>
             <w:pPr>
-              <w:spacing w:after="0"/>
               <w:ind w:left="170"/>
               <w:jc w:val="center"/>
               <w:rPr>
@@ -2277,7 +2147,6 @@
           </w:tcPr>
           <w:p>
             <w:pPr>
-              <w:spacing w:after="0"/>
               <w:ind w:right="2"/>
               <w:jc w:val="center"/>
               <w:rPr>
@@ -2305,7 +2174,6 @@
           </w:tcPr>
           <w:p>
             <w:pPr>
-              <w:spacing w:after="0"/>
               <w:ind w:left="26"/>
               <w:jc w:val="center"/>
               <w:rPr>
@@ -2338,7 +2206,6 @@
           </w:tcPr>
           <w:p>
             <w:pPr>
-              <w:spacing w:after="0"/>
               <w:ind w:left="54"/>
               <w:jc w:val="center"/>
               <w:rPr>
@@ -2366,7 +2233,6 @@
           </w:tcPr>
           <w:p>
             <w:pPr>
-              <w:spacing w:after="0"/>
               <w:ind w:left="165" w:right="104"/>
               <w:jc w:val="center"/>
               <w:rPr>
@@ -2394,7 +2260,6 @@
           </w:tcPr>
           <w:p>
             <w:pPr>
-              <w:spacing w:after="0"/>
               <w:ind w:right="144"/>
               <w:jc w:val="center"/>
               <w:rPr>
@@ -2422,7 +2287,6 @@
           </w:tcPr>
           <w:p>
             <w:pPr>
-              <w:spacing w:after="0"/>
               <w:ind w:left="170"/>
               <w:jc w:val="center"/>
               <w:rPr>
@@ -2456,7 +2320,6 @@
           </w:tcPr>
           <w:p>
             <w:pPr>
-              <w:spacing w:after="0"/>
               <w:ind w:right="2"/>
               <w:jc w:val="center"/>
               <w:rPr>
@@ -2484,7 +2347,6 @@
           </w:tcPr>
           <w:p>
             <w:pPr>
-              <w:spacing w:after="0"/>
               <w:jc w:val="center"/>
               <w:rPr>
                 <w:rFonts w:ascii="Times New Roman" w:hAnsi="Times New Roman" w:cs="Times New Roman"/>
@@ -2522,7 +2384,6 @@
           </w:tcPr>
           <w:p>
             <w:pPr>
-              <w:spacing w:after="0"/>
               <w:ind w:left="54"/>
               <w:jc w:val="center"/>
               <w:rPr>
@@ -2566,7 +2427,6 @@
           </w:p>
           <w:p>
             <w:pPr>
-              <w:spacing w:after="0"/>
               <w:ind w:left="1"/>
               <w:jc w:val="center"/>
               <w:rPr>
@@ -2608,7 +2468,6 @@
           </w:tcPr>
           <w:p>
             <w:pPr>
-              <w:spacing w:after="0"/>
               <w:ind w:left="1"/>
               <w:jc w:val="center"/>
               <w:rPr>
@@ -2650,7 +2509,6 @@
           </w:tcPr>
           <w:p>
             <w:pPr>
-              <w:spacing w:after="0"/>
               <w:ind w:left="206"/>
               <w:jc w:val="center"/>
               <w:rPr>
@@ -2698,7 +2556,6 @@
           </w:tcPr>
           <w:p>
             <w:pPr>
-              <w:spacing w:after="0"/>
               <w:ind w:right="2"/>
               <w:jc w:val="center"/>
               <w:rPr>
@@ -2726,7 +2583,6 @@
           </w:tcPr>
           <w:p>
             <w:pPr>
-              <w:spacing w:after="0"/>
               <w:ind w:left="14"/>
               <w:jc w:val="center"/>
               <w:rPr>
@@ -2759,7 +2615,6 @@
           </w:tcPr>
           <w:p>
             <w:pPr>
-              <w:spacing w:after="0"/>
               <w:ind w:left="54"/>
               <w:jc w:val="center"/>
               <w:rPr>
@@ -2787,7 +2642,6 @@
           </w:tcPr>
           <w:p>
             <w:pPr>
-              <w:spacing w:after="0"/>
               <w:ind w:left="136"/>
               <w:jc w:val="center"/>
               <w:rPr>
@@ -2815,7 +2669,6 @@
           </w:tcPr>
           <w:p>
             <w:pPr>
-              <w:spacing w:after="0"/>
               <w:ind w:left="135"/>
               <w:jc w:val="center"/>
               <w:rPr>
@@ -2843,7 +2696,6 @@
           </w:tcPr>
           <w:p>
             <w:pPr>
-              <w:spacing w:after="0"/>
               <w:ind w:left="1"/>
               <w:jc w:val="center"/>
               <w:rPr>
@@ -2877,7 +2729,6 @@
           </w:tcPr>
           <w:p>
             <w:pPr>
-              <w:spacing w:after="0"/>
               <w:ind w:right="2"/>
               <w:jc w:val="center"/>
               <w:rPr>
@@ -2905,7 +2756,6 @@
           </w:tcPr>
           <w:p>
             <w:pPr>
-              <w:spacing w:after="0"/>
               <w:jc w:val="center"/>
               <w:rPr>
                 <w:rFonts w:ascii="Times New Roman" w:hAnsi="Times New Roman" w:cs="Times New Roman"/>
@@ -2943,7 +2793,6 @@
           </w:tcPr>
           <w:p>
             <w:pPr>
-              <w:spacing w:after="0"/>
               <w:ind w:left="54"/>
               <w:jc w:val="center"/>
               <w:rPr>
@@ -2971,7 +2820,6 @@
           </w:tcPr>
           <w:p>
             <w:pPr>
-              <w:spacing w:after="0"/>
               <w:ind w:right="99"/>
               <w:jc w:val="center"/>
               <w:rPr>
@@ -2999,7 +2847,6 @@
           </w:tcPr>
           <w:p>
             <w:pPr>
-              <w:spacing w:after="0"/>
               <w:ind w:left="134"/>
               <w:jc w:val="center"/>
               <w:rPr>
@@ -3027,7 +2874,6 @@
           </w:tcPr>
           <w:p>
             <w:pPr>
-              <w:spacing w:after="0"/>
               <w:ind w:left="1"/>
               <w:jc w:val="center"/>
               <w:rPr>
@@ -3061,7 +2907,6 @@
           </w:tcPr>
           <w:p>
             <w:pPr>
-              <w:spacing w:after="0"/>
               <w:ind w:right="2"/>
               <w:jc w:val="center"/>
               <w:rPr>
@@ -3089,7 +2934,6 @@
           </w:tcPr>
           <w:p>
             <w:pPr>
-              <w:spacing w:after="0"/>
               <w:jc w:val="center"/>
               <w:rPr>
                 <w:rFonts w:ascii="Times New Roman" w:hAnsi="Times New Roman" w:cs="Times New Roman"/>
@@ -3121,7 +2965,6 @@
           </w:tcPr>
           <w:p>
             <w:pPr>
-              <w:spacing w:after="0"/>
               <w:ind w:left="54"/>
               <w:jc w:val="center"/>
               <w:rPr>
@@ -3149,7 +2992,6 @@
           </w:tcPr>
           <w:p>
             <w:pPr>
-              <w:spacing w:after="0"/>
               <w:ind w:left="136"/>
               <w:jc w:val="center"/>
               <w:rPr>
@@ -3165,7 +3007,6 @@
           </w:p>
           <w:p>
             <w:pPr>
-              <w:spacing w:after="0"/>
               <w:ind w:left="497"/>
               <w:jc w:val="center"/>
               <w:rPr>
@@ -3193,7 +3034,6 @@
           </w:tcPr>
           <w:p>
             <w:pPr>
-              <w:spacing w:after="0"/>
               <w:ind w:left="134"/>
               <w:jc w:val="center"/>
               <w:rPr>
@@ -3221,7 +3061,6 @@
           </w:tcPr>
           <w:p>
             <w:pPr>
-              <w:spacing w:after="0"/>
               <w:ind w:left="1"/>
               <w:jc w:val="center"/>
               <w:rPr>
@@ -3255,7 +3094,6 @@
           </w:tcPr>
           <w:p>
             <w:pPr>
-              <w:spacing w:after="0"/>
               <w:ind w:right="2"/>
               <w:jc w:val="center"/>
               <w:rPr>
@@ -3283,7 +3121,6 @@
           </w:tcPr>
           <w:p>
             <w:pPr>
-              <w:spacing w:after="0"/>
               <w:jc w:val="center"/>
               <w:rPr>
                 <w:rFonts w:ascii="Times New Roman" w:hAnsi="Times New Roman" w:cs="Times New Roman"/>
@@ -3311,6 +3148,7 @@
         </w:tc>
       </w:tr>
     </w:tbl>
+    <w:bookmarkEnd w:id="0"/>
     <w:p>
       <w:pPr>
         <w:spacing w:after="0"/>
@@ -3587,83 +3425,1672 @@
       <w:pPr>
         <w:spacing w:after="9"/>
         <w:rPr>
-          <w:rFonts w:ascii="Times New Roman" w:hAnsi="Times New Roman" w:cs="Times New Roman"/>
-        </w:rPr>
-      </w:pPr>
-    </w:p>
-    <w:p>
-      <w:pPr>
-        <w:spacing w:after="0"/>
-        <w:rPr>
-          <w:rFonts w:ascii="Times New Roman" w:hAnsi="Times New Roman" w:cs="Times New Roman"/>
-        </w:rPr>
-      </w:pPr>
-      <w:r>
-        <w:rPr>
           <w:rFonts w:ascii="Times New Roman" w:eastAsia="Arial" w:hAnsi="Times New Roman" w:cs="Times New Roman"/>
           <w:b/>
         </w:rPr>
+      </w:pPr>
+    </w:p>
+    <w:p>
+      <w:pPr>
+        <w:spacing w:after="9"/>
+        <w:rPr>
+          <w:rFonts w:ascii="Times New Roman" w:eastAsia="Arial" w:hAnsi="Times New Roman" w:cs="Times New Roman"/>
+          <w:b/>
+        </w:rPr>
+      </w:pPr>
+    </w:p>
+    <w:p>
+      <w:pPr>
+        <w:spacing w:after="9"/>
+        <w:rPr>
+          <w:rFonts w:ascii="Times New Roman" w:eastAsia="Arial" w:hAnsi="Times New Roman" w:cs="Times New Roman"/>
+          <w:b/>
+        </w:rPr>
+      </w:pPr>
+    </w:p>
+    <w:p>
+      <w:pPr>
+        <w:spacing w:after="9"/>
+        <w:rPr>
+          <w:rFonts w:ascii="Times New Roman" w:eastAsia="Arial" w:hAnsi="Times New Roman" w:cs="Times New Roman"/>
+          <w:b/>
+        </w:rPr>
+      </w:pPr>
+    </w:p>
+    <w:p>
+      <w:pPr>
+        <w:spacing w:after="9"/>
+        <w:rPr>
+          <w:rFonts w:ascii="Times New Roman" w:eastAsia="Arial" w:hAnsi="Times New Roman" w:cs="Times New Roman"/>
+          <w:b/>
+        </w:rPr>
+      </w:pPr>
+    </w:p>
+    <w:p>
+      <w:pPr>
+        <w:spacing w:after="9"/>
+        <w:rPr>
+          <w:rFonts w:ascii="Times New Roman" w:hAnsi="Times New Roman" w:cs="Times New Roman"/>
+        </w:rPr>
+      </w:pPr>
+    </w:p>
+    <w:p>
+      <w:pPr>
+        <w:spacing w:after="0"/>
+        <w:rPr>
+          <w:rFonts w:ascii="Times New Roman" w:hAnsi="Times New Roman" w:cs="Times New Roman"/>
+        </w:rPr>
+      </w:pPr>
+      <w:r>
+        <w:rPr>
+          <w:rFonts w:ascii="Times New Roman" w:eastAsia="Arial" w:hAnsi="Times New Roman" w:cs="Times New Roman"/>
+          <w:b/>
+        </w:rPr>
+        <w:lastRenderedPageBreak/>
         <w:t xml:space="preserve"> </w:t>
       </w:r>
     </w:p>
     <w:p>
       <w:pPr>
         <w:spacing w:after="115"/>
-        <w:rPr>
-          <w:rFonts w:ascii="Times New Roman" w:hAnsi="Times New Roman" w:cs="Times New Roman"/>
-          <w:sz w:val="24"/>
-          <w:szCs w:val="24"/>
-        </w:rPr>
-      </w:pPr>
-      <w:r>
         <w:rPr>
           <w:rFonts w:ascii="Times New Roman" w:eastAsia="Arial" w:hAnsi="Times New Roman" w:cs="Times New Roman"/>
           <w:b/>
           <w:sz w:val="24"/>
           <w:szCs w:val="24"/>
         </w:rPr>
-        <w:lastRenderedPageBreak/>
+      </w:pPr>
+      <w:r>
+        <w:rPr>
+          <w:rFonts w:ascii="Times New Roman" w:eastAsia="Arial" w:hAnsi="Times New Roman" w:cs="Times New Roman"/>
+          <w:b/>
+          <w:sz w:val="24"/>
+          <w:szCs w:val="24"/>
+        </w:rPr>
         <w:t xml:space="preserve">Step 5: Screenshots / Evidence </w:t>
       </w:r>
     </w:p>
     <w:p>
       <w:pPr>
-        <w:spacing w:after="26" w:line="245" w:lineRule="auto"/>
-        <w:ind w:left="-15" w:right="587"/>
+        <w:spacing w:after="115"/>
+        <w:rPr>
+          <w:rFonts w:ascii="Times New Roman" w:eastAsia="Arial" w:hAnsi="Times New Roman" w:cs="Times New Roman"/>
+          <w:b/>
+          <w:sz w:val="24"/>
+          <w:szCs w:val="24"/>
+        </w:rPr>
+      </w:pPr>
+      <w:r>
+        <w:rPr>
+          <w:rFonts w:ascii="Times New Roman" w:eastAsia="Arial" w:hAnsi="Times New Roman" w:cs="Times New Roman"/>
+          <w:b/>
+          <w:sz w:val="24"/>
+          <w:szCs w:val="24"/>
+        </w:rPr>
+        <w:drawing>
+          <wp:inline distT="0" distB="0" distL="0" distR="0" wp14:anchorId="411786AF" wp14:editId="0A6B6FD6">
+            <wp:extent cx="6619875" cy="2813050"/>
+            <wp:effectExtent l="0" t="0" r="9525" b="6350"/>
+            <wp:docPr id="8" name="Picture 8"/>
+            <wp:cNvGraphicFramePr>
+              <a:graphicFrameLocks xmlns:a="http://schemas.openxmlformats.org/drawingml/2006/main" noChangeAspect="1"/>
+            </wp:cNvGraphicFramePr>
+            <a:graphic xmlns:a="http://schemas.openxmlformats.org/drawingml/2006/main">
+              <a:graphicData uri="http://schemas.openxmlformats.org/drawingml/2006/picture">
+                <pic:pic xmlns:pic="http://schemas.openxmlformats.org/drawingml/2006/picture">
+                  <pic:nvPicPr>
+                    <pic:cNvPr id="1" name=""/>
+                    <pic:cNvPicPr/>
+                  </pic:nvPicPr>
+                  <pic:blipFill>
+                    <a:blip r:embed="rId7"/>
+                    <a:stretch>
+                      <a:fillRect/>
+                    </a:stretch>
+                  </pic:blipFill>
+                  <pic:spPr>
+                    <a:xfrm>
+                      <a:off x="0" y="0"/>
+                      <a:ext cx="6619875" cy="2813050"/>
+                    </a:xfrm>
+                    <a:prstGeom prst="rect">
+                      <a:avLst/>
+                    </a:prstGeom>
+                  </pic:spPr>
+                </pic:pic>
+              </a:graphicData>
+            </a:graphic>
+          </wp:inline>
+        </w:drawing>
+      </w:r>
+    </w:p>
+    <w:p>
+      <w:pPr>
+        <w:spacing w:after="115"/>
+        <w:rPr>
+          <w:rFonts w:ascii="Times New Roman" w:eastAsia="Arial" w:hAnsi="Times New Roman" w:cs="Times New Roman"/>
+          <w:b/>
+          <w:sz w:val="24"/>
+          <w:szCs w:val="24"/>
+        </w:rPr>
+      </w:pPr>
+    </w:p>
+    <w:p>
+      <w:pPr>
+        <w:spacing w:after="115"/>
         <w:rPr>
           <w:rFonts w:ascii="Times New Roman" w:hAnsi="Times New Roman" w:cs="Times New Roman"/>
+          <w:sz w:val="24"/>
+          <w:szCs w:val="24"/>
+        </w:rPr>
+      </w:pPr>
+    </w:p>
+    <w:p>
+      <w:pPr>
+        <w:spacing w:after="0"/>
+        <w:rPr>
+          <w:rStyle w:val="Normal"/>
+          <w:rFonts w:ascii="Times New Roman" w:eastAsia="Times New Roman" w:hAnsi="Times New Roman" w:cs="Times New Roman"/>
+          <w:snapToGrid w:val="0"/>
+          <w:w w:val="0"/>
+          <w:sz w:val="0"/>
+          <w:szCs w:val="0"/>
+          <w:u w:color="000000"/>
+          <w:bdr w:val="none" w:sz="0" w:space="0" w:color="000000"/>
+          <w:shd w:val="clear" w:color="000000" w:fill="000000"/>
+          <w:lang w:val="x-none" w:eastAsia="x-none" w:bidi="x-none"/>
         </w:rPr>
       </w:pPr>
       <w:r>
         <w:rPr>
           <w:rFonts w:ascii="Times New Roman" w:eastAsia="Arial" w:hAnsi="Times New Roman" w:cs="Times New Roman"/>
-        </w:rPr>
-        <w:t xml:space="preserve">Attach screenshots of your performance testing tool results below (e.g., </w:t>
-      </w:r>
-      <w:proofErr w:type="spellStart"/>
-      <w:r>
-        <w:rPr>
-          <w:rFonts w:ascii="Times New Roman" w:eastAsia="Arial" w:hAnsi="Times New Roman" w:cs="Times New Roman"/>
-        </w:rPr>
-        <w:t>JMeter</w:t>
-      </w:r>
-      <w:proofErr w:type="spellEnd"/>
-      <w:r>
-        <w:rPr>
-          <w:rFonts w:ascii="Times New Roman" w:eastAsia="Arial" w:hAnsi="Times New Roman" w:cs="Times New Roman"/>
-        </w:rPr>
-        <w:t xml:space="preserve"> report, Locust graphs, </w:t>
+          <w:noProof/>
+          <w:sz w:val="5"/>
+        </w:rPr>
+        <w:drawing>
+          <wp:inline distT="0" distB="0" distL="0" distR="0">
+            <wp:extent cx="6619875" cy="3722044"/>
+            <wp:effectExtent l="0" t="0" r="0" b="0"/>
+            <wp:docPr id="5" name="Picture 5" descr="D:\EduGenie\skill-wallet---GenAI-Project--main\images\Img1.jpeg"/>
+            <wp:cNvGraphicFramePr>
+              <a:graphicFrameLocks xmlns:a="http://schemas.openxmlformats.org/drawingml/2006/main" noChangeAspect="1"/>
+            </wp:cNvGraphicFramePr>
+            <a:graphic xmlns:a="http://schemas.openxmlformats.org/drawingml/2006/main">
+              <a:graphicData uri="http://schemas.openxmlformats.org/drawingml/2006/picture">
+                <pic:pic xmlns:pic="http://schemas.openxmlformats.org/drawingml/2006/picture">
+                  <pic:nvPicPr>
+                    <pic:cNvPr id="0" name="Picture 1" descr="D:\EduGenie\skill-wallet---GenAI-Project--main\images\Img1.jpeg"/>
+                    <pic:cNvPicPr>
+                      <a:picLocks noChangeAspect="1" noChangeArrowheads="1"/>
+                    </pic:cNvPicPr>
+                  </pic:nvPicPr>
+                  <pic:blipFill>
+                    <a:blip r:embed="rId8">
+                      <a:extLst>
+                        <a:ext uri="{28A0092B-C50C-407E-A947-70E740481C1C}">
+                          <a14:useLocalDpi xmlns:a14="http://schemas.microsoft.com/office/drawing/2010/main" val="0"/>
+                        </a:ext>
+                      </a:extLst>
+                    </a:blip>
+                    <a:srcRect/>
+                    <a:stretch>
+                      <a:fillRect/>
+                    </a:stretch>
+                  </pic:blipFill>
+                  <pic:spPr bwMode="auto">
+                    <a:xfrm>
+                      <a:off x="0" y="0"/>
+                      <a:ext cx="6619875" cy="3722044"/>
+                    </a:xfrm>
+                    <a:prstGeom prst="rect">
+                      <a:avLst/>
+                    </a:prstGeom>
+                    <a:noFill/>
+                    <a:ln>
+                      <a:noFill/>
+                    </a:ln>
+                  </pic:spPr>
+                </pic:pic>
+              </a:graphicData>
+            </a:graphic>
+          </wp:inline>
+        </w:drawing>
       </w:r>
       <w:r>
         <w:rPr>
+          <w:rStyle w:val="Normal"/>
+          <w:rFonts w:ascii="Times New Roman" w:eastAsia="Times New Roman" w:hAnsi="Times New Roman" w:cs="Times New Roman"/>
+          <w:snapToGrid w:val="0"/>
+          <w:w w:val="0"/>
+          <w:sz w:val="0"/>
+          <w:szCs w:val="0"/>
+          <w:u w:color="000000"/>
+          <w:bdr w:val="none" w:sz="0" w:space="0" w:color="000000"/>
+          <w:shd w:val="clear" w:color="000000" w:fill="000000"/>
+          <w:lang w:val="x-none" w:eastAsia="x-none" w:bidi="x-none"/>
+        </w:rPr>
+        <w:t xml:space="preserve"> </w:t>
+      </w:r>
+    </w:p>
+    <w:p>
+      <w:pPr>
+        <w:spacing w:after="0"/>
+        <w:rPr>
+          <w:rStyle w:val="Normal"/>
+          <w:rFonts w:ascii="Times New Roman" w:eastAsia="Times New Roman" w:hAnsi="Times New Roman" w:cs="Times New Roman"/>
+          <w:snapToGrid w:val="0"/>
+          <w:w w:val="0"/>
+          <w:sz w:val="0"/>
+          <w:szCs w:val="0"/>
+          <w:u w:color="000000"/>
+          <w:bdr w:val="none" w:sz="0" w:space="0" w:color="000000"/>
+          <w:shd w:val="clear" w:color="000000" w:fill="000000"/>
+          <w:lang w:val="x-none" w:eastAsia="x-none" w:bidi="x-none"/>
+        </w:rPr>
+      </w:pPr>
+    </w:p>
+    <w:p>
+      <w:pPr>
+        <w:spacing w:after="0"/>
+        <w:rPr>
+          <w:rStyle w:val="Normal"/>
+          <w:rFonts w:ascii="Times New Roman" w:eastAsia="Times New Roman" w:hAnsi="Times New Roman" w:cs="Times New Roman"/>
+          <w:snapToGrid w:val="0"/>
+          <w:w w:val="0"/>
+          <w:sz w:val="0"/>
+          <w:szCs w:val="0"/>
+          <w:u w:color="000000"/>
+          <w:bdr w:val="none" w:sz="0" w:space="0" w:color="000000"/>
+          <w:shd w:val="clear" w:color="000000" w:fill="000000"/>
+          <w:lang w:val="x-none" w:eastAsia="x-none" w:bidi="x-none"/>
+        </w:rPr>
+      </w:pPr>
+    </w:p>
+    <w:p>
+      <w:pPr>
+        <w:spacing w:after="0"/>
+        <w:rPr>
+          <w:rStyle w:val="Normal"/>
+          <w:rFonts w:ascii="Times New Roman" w:eastAsia="Times New Roman" w:hAnsi="Times New Roman" w:cs="Times New Roman"/>
+          <w:snapToGrid w:val="0"/>
+          <w:w w:val="0"/>
+          <w:sz w:val="0"/>
+          <w:szCs w:val="0"/>
+          <w:u w:color="000000"/>
+          <w:bdr w:val="none" w:sz="0" w:space="0" w:color="000000"/>
+          <w:shd w:val="clear" w:color="000000" w:fill="000000"/>
+          <w:lang w:val="x-none" w:eastAsia="x-none" w:bidi="x-none"/>
+        </w:rPr>
+      </w:pPr>
+    </w:p>
+    <w:p>
+      <w:pPr>
+        <w:spacing w:after="0"/>
+        <w:rPr>
+          <w:rStyle w:val="Normal"/>
+          <w:rFonts w:ascii="Times New Roman" w:eastAsia="Times New Roman" w:hAnsi="Times New Roman" w:cs="Times New Roman"/>
+          <w:snapToGrid w:val="0"/>
+          <w:w w:val="0"/>
+          <w:sz w:val="0"/>
+          <w:szCs w:val="0"/>
+          <w:u w:color="000000"/>
+          <w:bdr w:val="none" w:sz="0" w:space="0" w:color="000000"/>
+          <w:shd w:val="clear" w:color="000000" w:fill="000000"/>
+          <w:lang w:val="x-none" w:eastAsia="x-none" w:bidi="x-none"/>
+        </w:rPr>
+      </w:pPr>
+    </w:p>
+    <w:p>
+      <w:pPr>
+        <w:spacing w:after="0"/>
+        <w:rPr>
+          <w:rStyle w:val="Normal"/>
+          <w:rFonts w:ascii="Times New Roman" w:eastAsia="Times New Roman" w:hAnsi="Times New Roman" w:cs="Times New Roman"/>
+          <w:snapToGrid w:val="0"/>
+          <w:w w:val="0"/>
+          <w:sz w:val="0"/>
+          <w:szCs w:val="0"/>
+          <w:u w:color="000000"/>
+          <w:bdr w:val="none" w:sz="0" w:space="0" w:color="000000"/>
+          <w:shd w:val="clear" w:color="000000" w:fill="000000"/>
+          <w:lang w:val="x-none" w:eastAsia="x-none" w:bidi="x-none"/>
+        </w:rPr>
+      </w:pPr>
+    </w:p>
+    <w:p>
+      <w:pPr>
+        <w:spacing w:after="0"/>
+        <w:rPr>
+          <w:rStyle w:val="Normal"/>
+          <w:rFonts w:ascii="Times New Roman" w:eastAsia="Times New Roman" w:hAnsi="Times New Roman" w:cs="Times New Roman"/>
+          <w:snapToGrid w:val="0"/>
+          <w:w w:val="0"/>
+          <w:sz w:val="0"/>
+          <w:szCs w:val="0"/>
+          <w:u w:color="000000"/>
+          <w:bdr w:val="none" w:sz="0" w:space="0" w:color="000000"/>
+          <w:shd w:val="clear" w:color="000000" w:fill="000000"/>
+          <w:lang w:val="x-none" w:eastAsia="x-none" w:bidi="x-none"/>
+        </w:rPr>
+      </w:pPr>
+    </w:p>
+    <w:p>
+      <w:pPr>
+        <w:spacing w:after="0"/>
+        <w:rPr>
+          <w:rStyle w:val="Normal"/>
+          <w:rFonts w:ascii="Times New Roman" w:eastAsia="Times New Roman" w:hAnsi="Times New Roman" w:cs="Times New Roman"/>
+          <w:snapToGrid w:val="0"/>
+          <w:w w:val="0"/>
+          <w:sz w:val="0"/>
+          <w:szCs w:val="0"/>
+          <w:u w:color="000000"/>
+          <w:bdr w:val="none" w:sz="0" w:space="0" w:color="000000"/>
+          <w:shd w:val="clear" w:color="000000" w:fill="000000"/>
+          <w:lang w:val="x-none" w:eastAsia="x-none" w:bidi="x-none"/>
+        </w:rPr>
+      </w:pPr>
+    </w:p>
+    <w:p>
+      <w:pPr>
+        <w:spacing w:after="0"/>
+        <w:rPr>
+          <w:rStyle w:val="Normal"/>
+          <w:rFonts w:ascii="Times New Roman" w:eastAsia="Times New Roman" w:hAnsi="Times New Roman" w:cs="Times New Roman"/>
+          <w:snapToGrid w:val="0"/>
+          <w:w w:val="0"/>
+          <w:sz w:val="0"/>
+          <w:szCs w:val="0"/>
+          <w:u w:color="000000"/>
+          <w:bdr w:val="none" w:sz="0" w:space="0" w:color="000000"/>
+          <w:shd w:val="clear" w:color="000000" w:fill="000000"/>
+          <w:lang w:val="x-none" w:eastAsia="x-none" w:bidi="x-none"/>
+        </w:rPr>
+      </w:pPr>
+    </w:p>
+    <w:p>
+      <w:pPr>
+        <w:spacing w:after="0"/>
+        <w:rPr>
+          <w:rStyle w:val="Normal"/>
+          <w:rFonts w:ascii="Times New Roman" w:eastAsia="Times New Roman" w:hAnsi="Times New Roman" w:cs="Times New Roman"/>
+          <w:snapToGrid w:val="0"/>
+          <w:w w:val="0"/>
+          <w:sz w:val="0"/>
+          <w:szCs w:val="0"/>
+          <w:u w:color="000000"/>
+          <w:bdr w:val="none" w:sz="0" w:space="0" w:color="000000"/>
+          <w:shd w:val="clear" w:color="000000" w:fill="000000"/>
+          <w:lang w:val="x-none" w:eastAsia="x-none" w:bidi="x-none"/>
+        </w:rPr>
+      </w:pPr>
+    </w:p>
+    <w:p>
+      <w:pPr>
+        <w:spacing w:after="0"/>
+        <w:rPr>
+          <w:rStyle w:val="Normal"/>
+          <w:rFonts w:ascii="Times New Roman" w:eastAsia="Times New Roman" w:hAnsi="Times New Roman" w:cs="Times New Roman"/>
+          <w:snapToGrid w:val="0"/>
+          <w:w w:val="0"/>
+          <w:sz w:val="0"/>
+          <w:szCs w:val="0"/>
+          <w:u w:color="000000"/>
+          <w:bdr w:val="none" w:sz="0" w:space="0" w:color="000000"/>
+          <w:shd w:val="clear" w:color="000000" w:fill="000000"/>
+          <w:lang w:val="x-none" w:eastAsia="x-none" w:bidi="x-none"/>
+        </w:rPr>
+      </w:pPr>
+    </w:p>
+    <w:p>
+      <w:pPr>
+        <w:spacing w:after="0"/>
+        <w:rPr>
+          <w:rStyle w:val="Normal"/>
+          <w:rFonts w:ascii="Times New Roman" w:eastAsia="Times New Roman" w:hAnsi="Times New Roman" w:cs="Times New Roman"/>
+          <w:snapToGrid w:val="0"/>
+          <w:w w:val="0"/>
+          <w:sz w:val="0"/>
+          <w:szCs w:val="0"/>
+          <w:u w:color="000000"/>
+          <w:bdr w:val="none" w:sz="0" w:space="0" w:color="000000"/>
+          <w:shd w:val="clear" w:color="000000" w:fill="000000"/>
+          <w:lang w:val="x-none" w:eastAsia="x-none" w:bidi="x-none"/>
+        </w:rPr>
+      </w:pPr>
+    </w:p>
+    <w:p>
+      <w:pPr>
+        <w:spacing w:after="0"/>
+        <w:rPr>
+          <w:rStyle w:val="Normal"/>
+          <w:rFonts w:ascii="Times New Roman" w:eastAsia="Times New Roman" w:hAnsi="Times New Roman" w:cs="Times New Roman"/>
+          <w:snapToGrid w:val="0"/>
+          <w:w w:val="0"/>
+          <w:sz w:val="0"/>
+          <w:szCs w:val="0"/>
+          <w:u w:color="000000"/>
+          <w:bdr w:val="none" w:sz="0" w:space="0" w:color="000000"/>
+          <w:shd w:val="clear" w:color="000000" w:fill="000000"/>
+          <w:lang w:val="x-none" w:eastAsia="x-none" w:bidi="x-none"/>
+        </w:rPr>
+      </w:pPr>
+    </w:p>
+    <w:p>
+      <w:pPr>
+        <w:spacing w:after="0"/>
+        <w:rPr>
+          <w:rStyle w:val="Normal"/>
+          <w:rFonts w:ascii="Times New Roman" w:eastAsia="Times New Roman" w:hAnsi="Times New Roman" w:cs="Times New Roman"/>
+          <w:snapToGrid w:val="0"/>
+          <w:w w:val="0"/>
+          <w:sz w:val="0"/>
+          <w:szCs w:val="0"/>
+          <w:u w:color="000000"/>
+          <w:bdr w:val="none" w:sz="0" w:space="0" w:color="000000"/>
+          <w:shd w:val="clear" w:color="000000" w:fill="000000"/>
+          <w:lang w:val="x-none" w:eastAsia="x-none" w:bidi="x-none"/>
+        </w:rPr>
+      </w:pPr>
+    </w:p>
+    <w:p>
+      <w:pPr>
+        <w:spacing w:after="0"/>
+        <w:rPr>
+          <w:rStyle w:val="Normal"/>
+          <w:rFonts w:ascii="Times New Roman" w:eastAsia="Times New Roman" w:hAnsi="Times New Roman" w:cs="Times New Roman"/>
+          <w:snapToGrid w:val="0"/>
+          <w:w w:val="0"/>
+          <w:sz w:val="0"/>
+          <w:szCs w:val="0"/>
+          <w:u w:color="000000"/>
+          <w:bdr w:val="none" w:sz="0" w:space="0" w:color="000000"/>
+          <w:shd w:val="clear" w:color="000000" w:fill="000000"/>
+          <w:lang w:val="x-none" w:eastAsia="x-none" w:bidi="x-none"/>
+        </w:rPr>
+      </w:pPr>
+    </w:p>
+    <w:p>
+      <w:pPr>
+        <w:spacing w:after="0"/>
+        <w:rPr>
+          <w:rStyle w:val="Normal"/>
+          <w:rFonts w:ascii="Times New Roman" w:eastAsia="Times New Roman" w:hAnsi="Times New Roman" w:cs="Times New Roman"/>
+          <w:snapToGrid w:val="0"/>
+          <w:w w:val="0"/>
+          <w:sz w:val="0"/>
+          <w:szCs w:val="0"/>
+          <w:u w:color="000000"/>
+          <w:bdr w:val="none" w:sz="0" w:space="0" w:color="000000"/>
+          <w:shd w:val="clear" w:color="000000" w:fill="000000"/>
+          <w:lang w:val="x-none" w:eastAsia="x-none" w:bidi="x-none"/>
+        </w:rPr>
+      </w:pPr>
+    </w:p>
+    <w:p>
+      <w:pPr>
+        <w:spacing w:after="0"/>
+        <w:rPr>
+          <w:rStyle w:val="Normal"/>
+          <w:rFonts w:ascii="Times New Roman" w:eastAsia="Times New Roman" w:hAnsi="Times New Roman" w:cs="Times New Roman"/>
+          <w:snapToGrid w:val="0"/>
+          <w:w w:val="0"/>
+          <w:sz w:val="0"/>
+          <w:szCs w:val="0"/>
+          <w:u w:color="000000"/>
+          <w:bdr w:val="none" w:sz="0" w:space="0" w:color="000000"/>
+          <w:shd w:val="clear" w:color="000000" w:fill="000000"/>
+          <w:lang w:val="x-none" w:eastAsia="x-none" w:bidi="x-none"/>
+        </w:rPr>
+      </w:pPr>
+    </w:p>
+    <w:p>
+      <w:pPr>
+        <w:spacing w:after="0"/>
+        <w:rPr>
+          <w:rStyle w:val="Normal"/>
+          <w:rFonts w:ascii="Times New Roman" w:eastAsia="Times New Roman" w:hAnsi="Times New Roman" w:cs="Times New Roman"/>
+          <w:snapToGrid w:val="0"/>
+          <w:w w:val="0"/>
+          <w:sz w:val="0"/>
+          <w:szCs w:val="0"/>
+          <w:u w:color="000000"/>
+          <w:bdr w:val="none" w:sz="0" w:space="0" w:color="000000"/>
+          <w:shd w:val="clear" w:color="000000" w:fill="000000"/>
+          <w:lang w:val="x-none" w:eastAsia="x-none" w:bidi="x-none"/>
+        </w:rPr>
+      </w:pPr>
+    </w:p>
+    <w:p>
+      <w:pPr>
+        <w:spacing w:after="0"/>
+        <w:rPr>
+          <w:rStyle w:val="Normal"/>
+          <w:rFonts w:ascii="Times New Roman" w:eastAsia="Times New Roman" w:hAnsi="Times New Roman" w:cs="Times New Roman"/>
+          <w:snapToGrid w:val="0"/>
+          <w:w w:val="0"/>
+          <w:sz w:val="0"/>
+          <w:szCs w:val="0"/>
+          <w:u w:color="000000"/>
+          <w:bdr w:val="none" w:sz="0" w:space="0" w:color="000000"/>
+          <w:shd w:val="clear" w:color="000000" w:fill="000000"/>
+          <w:lang w:val="x-none" w:eastAsia="x-none" w:bidi="x-none"/>
+        </w:rPr>
+      </w:pPr>
+    </w:p>
+    <w:p>
+      <w:pPr>
+        <w:spacing w:after="0"/>
+        <w:rPr>
+          <w:rStyle w:val="Normal"/>
+          <w:rFonts w:ascii="Times New Roman" w:eastAsia="Times New Roman" w:hAnsi="Times New Roman" w:cs="Times New Roman"/>
+          <w:snapToGrid w:val="0"/>
+          <w:w w:val="0"/>
+          <w:sz w:val="0"/>
+          <w:szCs w:val="0"/>
+          <w:u w:color="000000"/>
+          <w:bdr w:val="none" w:sz="0" w:space="0" w:color="000000"/>
+          <w:shd w:val="clear" w:color="000000" w:fill="000000"/>
+          <w:lang w:val="x-none" w:eastAsia="x-none" w:bidi="x-none"/>
+        </w:rPr>
+      </w:pPr>
+    </w:p>
+    <w:p>
+      <w:pPr>
+        <w:spacing w:after="0"/>
+        <w:rPr>
+          <w:rStyle w:val="Normal"/>
+          <w:rFonts w:ascii="Times New Roman" w:eastAsia="Times New Roman" w:hAnsi="Times New Roman" w:cs="Times New Roman"/>
+          <w:snapToGrid w:val="0"/>
+          <w:w w:val="0"/>
+          <w:sz w:val="0"/>
+          <w:szCs w:val="0"/>
+          <w:u w:color="000000"/>
+          <w:bdr w:val="none" w:sz="0" w:space="0" w:color="000000"/>
+          <w:shd w:val="clear" w:color="000000" w:fill="000000"/>
+          <w:lang w:val="x-none" w:eastAsia="x-none" w:bidi="x-none"/>
+        </w:rPr>
+      </w:pPr>
+    </w:p>
+    <w:p>
+      <w:pPr>
+        <w:spacing w:after="0"/>
+        <w:rPr>
+          <w:rStyle w:val="Normal"/>
+          <w:rFonts w:ascii="Times New Roman" w:eastAsia="Times New Roman" w:hAnsi="Times New Roman" w:cs="Times New Roman"/>
+          <w:snapToGrid w:val="0"/>
+          <w:w w:val="0"/>
+          <w:sz w:val="0"/>
+          <w:szCs w:val="0"/>
+          <w:u w:color="000000"/>
+          <w:bdr w:val="none" w:sz="0" w:space="0" w:color="000000"/>
+          <w:shd w:val="clear" w:color="000000" w:fill="000000"/>
+          <w:lang w:val="x-none" w:eastAsia="x-none" w:bidi="x-none"/>
+        </w:rPr>
+      </w:pPr>
+    </w:p>
+    <w:p>
+      <w:pPr>
+        <w:spacing w:after="0"/>
+        <w:rPr>
+          <w:rStyle w:val="Normal"/>
+          <w:rFonts w:ascii="Times New Roman" w:eastAsia="Times New Roman" w:hAnsi="Times New Roman" w:cs="Times New Roman"/>
+          <w:snapToGrid w:val="0"/>
+          <w:w w:val="0"/>
+          <w:sz w:val="0"/>
+          <w:szCs w:val="0"/>
+          <w:u w:color="000000"/>
+          <w:bdr w:val="none" w:sz="0" w:space="0" w:color="000000"/>
+          <w:shd w:val="clear" w:color="000000" w:fill="000000"/>
+          <w:lang w:val="x-none" w:eastAsia="x-none" w:bidi="x-none"/>
+        </w:rPr>
+      </w:pPr>
+    </w:p>
+    <w:p>
+      <w:pPr>
+        <w:spacing w:after="0"/>
+        <w:rPr>
+          <w:rStyle w:val="Normal"/>
+          <w:rFonts w:ascii="Times New Roman" w:eastAsia="Times New Roman" w:hAnsi="Times New Roman" w:cs="Times New Roman"/>
+          <w:snapToGrid w:val="0"/>
+          <w:w w:val="0"/>
+          <w:sz w:val="0"/>
+          <w:szCs w:val="0"/>
+          <w:u w:color="000000"/>
+          <w:bdr w:val="none" w:sz="0" w:space="0" w:color="000000"/>
+          <w:shd w:val="clear" w:color="000000" w:fill="000000"/>
+          <w:lang w:val="x-none" w:eastAsia="x-none" w:bidi="x-none"/>
+        </w:rPr>
+      </w:pPr>
+    </w:p>
+    <w:p>
+      <w:pPr>
+        <w:spacing w:after="0"/>
+        <w:rPr>
+          <w:rStyle w:val="Normal"/>
+          <w:rFonts w:ascii="Times New Roman" w:eastAsia="Times New Roman" w:hAnsi="Times New Roman" w:cs="Times New Roman"/>
+          <w:snapToGrid w:val="0"/>
+          <w:w w:val="0"/>
+          <w:sz w:val="0"/>
+          <w:szCs w:val="0"/>
+          <w:u w:color="000000"/>
+          <w:bdr w:val="none" w:sz="0" w:space="0" w:color="000000"/>
+          <w:shd w:val="clear" w:color="000000" w:fill="000000"/>
+          <w:lang w:val="x-none" w:eastAsia="x-none" w:bidi="x-none"/>
+        </w:rPr>
+      </w:pPr>
+    </w:p>
+    <w:p>
+      <w:pPr>
+        <w:spacing w:after="0"/>
+        <w:rPr>
+          <w:rStyle w:val="Normal"/>
+          <w:rFonts w:ascii="Times New Roman" w:eastAsia="Times New Roman" w:hAnsi="Times New Roman" w:cs="Times New Roman"/>
+          <w:snapToGrid w:val="0"/>
+          <w:w w:val="0"/>
+          <w:sz w:val="0"/>
+          <w:szCs w:val="0"/>
+          <w:u w:color="000000"/>
+          <w:bdr w:val="none" w:sz="0" w:space="0" w:color="000000"/>
+          <w:shd w:val="clear" w:color="000000" w:fill="000000"/>
+          <w:lang w:val="x-none" w:eastAsia="x-none" w:bidi="x-none"/>
+        </w:rPr>
+      </w:pPr>
+    </w:p>
+    <w:p>
+      <w:pPr>
+        <w:spacing w:after="0"/>
+        <w:rPr>
+          <w:rStyle w:val="Normal"/>
+          <w:rFonts w:ascii="Times New Roman" w:eastAsia="Times New Roman" w:hAnsi="Times New Roman" w:cs="Times New Roman"/>
+          <w:snapToGrid w:val="0"/>
+          <w:w w:val="0"/>
+          <w:sz w:val="0"/>
+          <w:szCs w:val="0"/>
+          <w:u w:color="000000"/>
+          <w:bdr w:val="none" w:sz="0" w:space="0" w:color="000000"/>
+          <w:shd w:val="clear" w:color="000000" w:fill="000000"/>
+          <w:lang w:val="x-none" w:eastAsia="x-none" w:bidi="x-none"/>
+        </w:rPr>
+      </w:pPr>
+    </w:p>
+    <w:p>
+      <w:pPr>
+        <w:spacing w:after="0"/>
+        <w:rPr>
+          <w:rStyle w:val="Normal"/>
+          <w:rFonts w:ascii="Times New Roman" w:eastAsia="Times New Roman" w:hAnsi="Times New Roman" w:cs="Times New Roman"/>
+          <w:snapToGrid w:val="0"/>
+          <w:w w:val="0"/>
+          <w:sz w:val="0"/>
+          <w:szCs w:val="0"/>
+          <w:u w:color="000000"/>
+          <w:bdr w:val="none" w:sz="0" w:space="0" w:color="000000"/>
+          <w:shd w:val="clear" w:color="000000" w:fill="000000"/>
+          <w:lang w:val="x-none" w:eastAsia="x-none" w:bidi="x-none"/>
+        </w:rPr>
+      </w:pPr>
+    </w:p>
+    <w:p>
+      <w:pPr>
+        <w:spacing w:after="0"/>
+        <w:rPr>
+          <w:rStyle w:val="Normal"/>
+          <w:rFonts w:ascii="Times New Roman" w:eastAsia="Times New Roman" w:hAnsi="Times New Roman" w:cs="Times New Roman"/>
+          <w:snapToGrid w:val="0"/>
+          <w:w w:val="0"/>
+          <w:sz w:val="0"/>
+          <w:szCs w:val="0"/>
+          <w:u w:color="000000"/>
+          <w:bdr w:val="none" w:sz="0" w:space="0" w:color="000000"/>
+          <w:shd w:val="clear" w:color="000000" w:fill="000000"/>
+          <w:lang w:val="x-none" w:eastAsia="x-none" w:bidi="x-none"/>
+        </w:rPr>
+      </w:pPr>
+    </w:p>
+    <w:p>
+      <w:pPr>
+        <w:spacing w:after="0"/>
+        <w:rPr>
+          <w:rStyle w:val="Normal"/>
+          <w:rFonts w:ascii="Times New Roman" w:eastAsia="Times New Roman" w:hAnsi="Times New Roman" w:cs="Times New Roman"/>
+          <w:snapToGrid w:val="0"/>
+          <w:w w:val="0"/>
+          <w:sz w:val="0"/>
+          <w:szCs w:val="0"/>
+          <w:u w:color="000000"/>
+          <w:bdr w:val="none" w:sz="0" w:space="0" w:color="000000"/>
+          <w:shd w:val="clear" w:color="000000" w:fill="000000"/>
+          <w:lang w:val="x-none" w:eastAsia="x-none" w:bidi="x-none"/>
+        </w:rPr>
+      </w:pPr>
+    </w:p>
+    <w:p>
+      <w:pPr>
+        <w:spacing w:after="0"/>
+        <w:rPr>
+          <w:rStyle w:val="Normal"/>
+          <w:rFonts w:ascii="Times New Roman" w:eastAsia="Times New Roman" w:hAnsi="Times New Roman" w:cs="Times New Roman"/>
+          <w:snapToGrid w:val="0"/>
+          <w:w w:val="0"/>
+          <w:sz w:val="0"/>
+          <w:szCs w:val="0"/>
+          <w:u w:color="000000"/>
+          <w:bdr w:val="none" w:sz="0" w:space="0" w:color="000000"/>
+          <w:shd w:val="clear" w:color="000000" w:fill="000000"/>
+          <w:lang w:val="x-none" w:eastAsia="x-none" w:bidi="x-none"/>
+        </w:rPr>
+      </w:pPr>
+    </w:p>
+    <w:p>
+      <w:pPr>
+        <w:spacing w:after="0"/>
+        <w:rPr>
+          <w:rStyle w:val="Normal"/>
+          <w:rFonts w:ascii="Times New Roman" w:eastAsia="Times New Roman" w:hAnsi="Times New Roman" w:cs="Times New Roman"/>
+          <w:snapToGrid w:val="0"/>
+          <w:w w:val="0"/>
+          <w:sz w:val="0"/>
+          <w:szCs w:val="0"/>
+          <w:u w:color="000000"/>
+          <w:bdr w:val="none" w:sz="0" w:space="0" w:color="000000"/>
+          <w:shd w:val="clear" w:color="000000" w:fill="000000"/>
+          <w:lang w:val="x-none" w:eastAsia="x-none" w:bidi="x-none"/>
+        </w:rPr>
+      </w:pPr>
+    </w:p>
+    <w:p>
+      <w:pPr>
+        <w:spacing w:after="0"/>
+        <w:rPr>
+          <w:rStyle w:val="Normal"/>
+          <w:rFonts w:ascii="Times New Roman" w:eastAsia="Times New Roman" w:hAnsi="Times New Roman" w:cs="Times New Roman"/>
+          <w:snapToGrid w:val="0"/>
+          <w:w w:val="0"/>
+          <w:sz w:val="0"/>
+          <w:szCs w:val="0"/>
+          <w:u w:color="000000"/>
+          <w:bdr w:val="none" w:sz="0" w:space="0" w:color="000000"/>
+          <w:shd w:val="clear" w:color="000000" w:fill="000000"/>
+          <w:lang w:val="x-none" w:eastAsia="x-none" w:bidi="x-none"/>
+        </w:rPr>
+      </w:pPr>
+    </w:p>
+    <w:p>
+      <w:pPr>
+        <w:spacing w:after="0"/>
+        <w:rPr>
+          <w:rStyle w:val="Normal"/>
+          <w:rFonts w:ascii="Times New Roman" w:eastAsia="Times New Roman" w:hAnsi="Times New Roman" w:cs="Times New Roman"/>
+          <w:snapToGrid w:val="0"/>
+          <w:w w:val="0"/>
+          <w:sz w:val="0"/>
+          <w:szCs w:val="0"/>
+          <w:u w:color="000000"/>
+          <w:bdr w:val="none" w:sz="0" w:space="0" w:color="000000"/>
+          <w:shd w:val="clear" w:color="000000" w:fill="000000"/>
+          <w:lang w:val="x-none" w:eastAsia="x-none" w:bidi="x-none"/>
+        </w:rPr>
+      </w:pPr>
+    </w:p>
+    <w:p>
+      <w:pPr>
+        <w:spacing w:after="0"/>
+        <w:rPr>
+          <w:rStyle w:val="Normal"/>
+          <w:rFonts w:ascii="Times New Roman" w:eastAsia="Times New Roman" w:hAnsi="Times New Roman" w:cs="Times New Roman"/>
+          <w:snapToGrid w:val="0"/>
+          <w:w w:val="0"/>
+          <w:sz w:val="20"/>
+          <w:szCs w:val="20"/>
+          <w:u w:color="000000"/>
+          <w:bdr w:val="none" w:sz="0" w:space="0" w:color="000000"/>
+          <w:shd w:val="clear" w:color="000000" w:fill="000000"/>
+          <w:lang w:val="x-none" w:eastAsia="x-none" w:bidi="x-none"/>
+        </w:rPr>
+      </w:pPr>
+    </w:p>
+    <w:p>
+      <w:pPr>
+        <w:spacing w:after="0"/>
+        <w:rPr>
+          <w:rStyle w:val="Normal"/>
+          <w:rFonts w:ascii="Times New Roman" w:eastAsia="Times New Roman" w:hAnsi="Times New Roman" w:cs="Times New Roman"/>
+          <w:snapToGrid w:val="0"/>
+          <w:w w:val="0"/>
+          <w:sz w:val="0"/>
+          <w:szCs w:val="0"/>
+          <w:u w:color="000000"/>
+          <w:bdr w:val="none" w:sz="0" w:space="0" w:color="000000"/>
+          <w:shd w:val="clear" w:color="000000" w:fill="000000"/>
+          <w:lang w:val="x-none" w:eastAsia="x-none" w:bidi="x-none"/>
+        </w:rPr>
+      </w:pPr>
+    </w:p>
+    <w:p>
+      <w:pPr>
+        <w:spacing w:after="0"/>
+        <w:rPr>
+          <w:rStyle w:val="Normal"/>
+          <w:rFonts w:ascii="Times New Roman" w:eastAsia="Times New Roman" w:hAnsi="Times New Roman" w:cs="Times New Roman"/>
+          <w:snapToGrid w:val="0"/>
+          <w:w w:val="0"/>
+          <w:sz w:val="0"/>
+          <w:szCs w:val="0"/>
+          <w:u w:color="000000"/>
+          <w:bdr w:val="none" w:sz="0" w:space="0" w:color="000000"/>
+          <w:shd w:val="clear" w:color="000000" w:fill="000000"/>
+          <w:lang w:val="x-none" w:eastAsia="x-none" w:bidi="x-none"/>
+        </w:rPr>
+      </w:pPr>
+    </w:p>
+    <w:p>
+      <w:pPr>
+        <w:spacing w:after="0"/>
+        <w:rPr>
+          <w:rStyle w:val="Normal"/>
+          <w:rFonts w:ascii="Times New Roman" w:eastAsia="Times New Roman" w:hAnsi="Times New Roman" w:cs="Times New Roman"/>
+          <w:snapToGrid w:val="0"/>
+          <w:w w:val="0"/>
+          <w:sz w:val="0"/>
+          <w:szCs w:val="0"/>
+          <w:u w:color="000000"/>
+          <w:bdr w:val="none" w:sz="0" w:space="0" w:color="000000"/>
+          <w:shd w:val="clear" w:color="000000" w:fill="000000"/>
+          <w:lang w:val="x-none" w:eastAsia="x-none" w:bidi="x-none"/>
+        </w:rPr>
+      </w:pPr>
+    </w:p>
+    <w:p>
+      <w:pPr>
+        <w:spacing w:after="0"/>
+        <w:rPr>
+          <w:rStyle w:val="Normal"/>
+          <w:rFonts w:ascii="Times New Roman" w:eastAsia="Times New Roman" w:hAnsi="Times New Roman" w:cs="Times New Roman"/>
+          <w:snapToGrid w:val="0"/>
+          <w:w w:val="0"/>
+          <w:sz w:val="0"/>
+          <w:szCs w:val="0"/>
+          <w:u w:color="000000"/>
+          <w:bdr w:val="none" w:sz="0" w:space="0" w:color="000000"/>
+          <w:shd w:val="clear" w:color="000000" w:fill="000000"/>
+          <w:lang w:val="x-none" w:eastAsia="x-none" w:bidi="x-none"/>
+        </w:rPr>
+      </w:pPr>
+    </w:p>
+    <w:p>
+      <w:pPr>
+        <w:spacing w:after="0"/>
+        <w:rPr>
+          <w:rStyle w:val="Normal"/>
+          <w:rFonts w:ascii="Times New Roman" w:eastAsia="Times New Roman" w:hAnsi="Times New Roman" w:cs="Times New Roman"/>
+          <w:snapToGrid w:val="0"/>
+          <w:w w:val="0"/>
+          <w:sz w:val="0"/>
+          <w:szCs w:val="0"/>
+          <w:u w:color="000000"/>
+          <w:bdr w:val="none" w:sz="0" w:space="0" w:color="000000"/>
+          <w:shd w:val="clear" w:color="000000" w:fill="000000"/>
+          <w:lang w:val="x-none" w:eastAsia="x-none" w:bidi="x-none"/>
+        </w:rPr>
+      </w:pPr>
+    </w:p>
+    <w:p>
+      <w:pPr>
+        <w:spacing w:after="0"/>
+        <w:rPr>
+          <w:rStyle w:val="Normal"/>
+          <w:rFonts w:ascii="Times New Roman" w:eastAsia="Times New Roman" w:hAnsi="Times New Roman" w:cs="Times New Roman"/>
+          <w:snapToGrid w:val="0"/>
+          <w:w w:val="0"/>
+          <w:sz w:val="0"/>
+          <w:szCs w:val="0"/>
+          <w:u w:color="000000"/>
+          <w:bdr w:val="none" w:sz="0" w:space="0" w:color="000000"/>
+          <w:shd w:val="clear" w:color="000000" w:fill="000000"/>
+          <w:lang w:val="x-none" w:eastAsia="x-none" w:bidi="x-none"/>
+        </w:rPr>
+      </w:pPr>
+    </w:p>
+    <w:p>
+      <w:pPr>
+        <w:spacing w:after="0"/>
+        <w:rPr>
+          <w:rStyle w:val="Normal"/>
+          <w:rFonts w:ascii="Times New Roman" w:eastAsia="Times New Roman" w:hAnsi="Times New Roman" w:cs="Times New Roman"/>
+          <w:snapToGrid w:val="0"/>
+          <w:w w:val="0"/>
+          <w:sz w:val="0"/>
+          <w:szCs w:val="0"/>
+          <w:u w:color="000000"/>
+          <w:bdr w:val="none" w:sz="0" w:space="0" w:color="000000"/>
+          <w:shd w:val="clear" w:color="000000" w:fill="000000"/>
+          <w:lang w:val="x-none" w:eastAsia="x-none" w:bidi="x-none"/>
+        </w:rPr>
+      </w:pPr>
+    </w:p>
+    <w:p>
+      <w:pPr>
+        <w:spacing w:after="0"/>
+        <w:rPr>
+          <w:rStyle w:val="Normal"/>
+          <w:rFonts w:ascii="Times New Roman" w:eastAsia="Times New Roman" w:hAnsi="Times New Roman" w:cs="Times New Roman"/>
+          <w:snapToGrid w:val="0"/>
+          <w:w w:val="0"/>
+          <w:sz w:val="0"/>
+          <w:szCs w:val="0"/>
+          <w:u w:color="000000"/>
+          <w:bdr w:val="none" w:sz="0" w:space="0" w:color="000000"/>
+          <w:shd w:val="clear" w:color="000000" w:fill="000000"/>
+          <w:lang w:val="x-none" w:eastAsia="x-none" w:bidi="x-none"/>
+        </w:rPr>
+      </w:pPr>
+    </w:p>
+    <w:p>
+      <w:pPr>
+        <w:spacing w:after="0"/>
+        <w:rPr>
+          <w:rStyle w:val="Normal"/>
+          <w:rFonts w:ascii="Times New Roman" w:eastAsia="Times New Roman" w:hAnsi="Times New Roman" w:cs="Times New Roman"/>
+          <w:snapToGrid w:val="0"/>
+          <w:w w:val="0"/>
+          <w:sz w:val="0"/>
+          <w:szCs w:val="0"/>
+          <w:u w:color="000000"/>
+          <w:bdr w:val="none" w:sz="0" w:space="0" w:color="000000"/>
+          <w:shd w:val="clear" w:color="000000" w:fill="000000"/>
+          <w:lang w:val="x-none" w:eastAsia="x-none" w:bidi="x-none"/>
+        </w:rPr>
+      </w:pPr>
+    </w:p>
+    <w:p>
+      <w:pPr>
+        <w:spacing w:after="0"/>
+        <w:rPr>
+          <w:rStyle w:val="Normal"/>
+          <w:rFonts w:ascii="Times New Roman" w:eastAsia="Times New Roman" w:hAnsi="Times New Roman" w:cs="Times New Roman"/>
+          <w:snapToGrid w:val="0"/>
+          <w:w w:val="0"/>
+          <w:sz w:val="0"/>
+          <w:szCs w:val="0"/>
+          <w:u w:color="000000"/>
+          <w:bdr w:val="none" w:sz="0" w:space="0" w:color="000000"/>
+          <w:shd w:val="clear" w:color="000000" w:fill="000000"/>
+          <w:lang w:val="x-none" w:eastAsia="x-none" w:bidi="x-none"/>
+        </w:rPr>
+      </w:pPr>
+    </w:p>
+    <w:p>
+      <w:pPr>
+        <w:spacing w:after="0"/>
+        <w:rPr>
+          <w:rStyle w:val="Normal"/>
+          <w:rFonts w:ascii="Times New Roman" w:eastAsia="Times New Roman" w:hAnsi="Times New Roman" w:cs="Times New Roman"/>
+          <w:snapToGrid w:val="0"/>
+          <w:w w:val="0"/>
+          <w:sz w:val="0"/>
+          <w:szCs w:val="0"/>
+          <w:u w:color="000000"/>
+          <w:bdr w:val="none" w:sz="0" w:space="0" w:color="000000"/>
+          <w:shd w:val="clear" w:color="000000" w:fill="000000"/>
+          <w:lang w:val="x-none" w:eastAsia="x-none" w:bidi="x-none"/>
+        </w:rPr>
+      </w:pPr>
+    </w:p>
+    <w:p>
+      <w:pPr>
+        <w:spacing w:after="0"/>
+        <w:rPr>
+          <w:rStyle w:val="Normal"/>
+          <w:rFonts w:ascii="Times New Roman" w:eastAsia="Times New Roman" w:hAnsi="Times New Roman" w:cs="Times New Roman"/>
+          <w:snapToGrid w:val="0"/>
+          <w:w w:val="0"/>
+          <w:sz w:val="0"/>
+          <w:szCs w:val="0"/>
+          <w:u w:color="000000"/>
+          <w:bdr w:val="none" w:sz="0" w:space="0" w:color="000000"/>
+          <w:shd w:val="clear" w:color="000000" w:fill="000000"/>
+          <w:lang w:val="x-none" w:eastAsia="x-none" w:bidi="x-none"/>
+        </w:rPr>
+      </w:pPr>
+    </w:p>
+    <w:p>
+      <w:pPr>
+        <w:spacing w:after="0"/>
+        <w:rPr>
+          <w:rStyle w:val="Normal"/>
+          <w:rFonts w:ascii="Times New Roman" w:eastAsia="Times New Roman" w:hAnsi="Times New Roman" w:cs="Times New Roman"/>
+          <w:snapToGrid w:val="0"/>
+          <w:w w:val="0"/>
+          <w:sz w:val="0"/>
+          <w:szCs w:val="0"/>
+          <w:u w:color="000000"/>
+          <w:bdr w:val="none" w:sz="0" w:space="0" w:color="000000"/>
+          <w:shd w:val="clear" w:color="000000" w:fill="000000"/>
+          <w:lang w:val="x-none" w:eastAsia="x-none" w:bidi="x-none"/>
+        </w:rPr>
+      </w:pPr>
+    </w:p>
+    <w:p>
+      <w:pPr>
+        <w:spacing w:after="0"/>
+        <w:rPr>
+          <w:rStyle w:val="Normal"/>
+          <w:rFonts w:ascii="Times New Roman" w:eastAsia="Times New Roman" w:hAnsi="Times New Roman" w:cs="Times New Roman"/>
+          <w:snapToGrid w:val="0"/>
+          <w:w w:val="0"/>
+          <w:sz w:val="0"/>
+          <w:szCs w:val="0"/>
+          <w:u w:color="000000"/>
+          <w:bdr w:val="none" w:sz="0" w:space="0" w:color="000000"/>
+          <w:shd w:val="clear" w:color="000000" w:fill="000000"/>
+          <w:lang w:val="x-none" w:eastAsia="x-none" w:bidi="x-none"/>
+        </w:rPr>
+      </w:pPr>
+    </w:p>
+    <w:p>
+      <w:pPr>
+        <w:spacing w:after="0"/>
+        <w:rPr>
+          <w:rStyle w:val="Normal"/>
+          <w:rFonts w:ascii="Times New Roman" w:eastAsia="Times New Roman" w:hAnsi="Times New Roman" w:cs="Times New Roman"/>
+          <w:snapToGrid w:val="0"/>
+          <w:w w:val="0"/>
+          <w:sz w:val="0"/>
+          <w:szCs w:val="0"/>
+          <w:u w:color="000000"/>
+          <w:bdr w:val="none" w:sz="0" w:space="0" w:color="000000"/>
+          <w:shd w:val="clear" w:color="000000" w:fill="000000"/>
+          <w:lang w:val="x-none" w:eastAsia="x-none" w:bidi="x-none"/>
+        </w:rPr>
+      </w:pPr>
+    </w:p>
+    <w:p>
+      <w:pPr>
+        <w:spacing w:after="0"/>
+        <w:rPr>
+          <w:rStyle w:val="Normal"/>
+          <w:rFonts w:ascii="Times New Roman" w:eastAsia="Times New Roman" w:hAnsi="Times New Roman" w:cs="Times New Roman"/>
+          <w:snapToGrid w:val="0"/>
+          <w:w w:val="0"/>
+          <w:sz w:val="0"/>
+          <w:szCs w:val="0"/>
+          <w:u w:color="000000"/>
+          <w:bdr w:val="none" w:sz="0" w:space="0" w:color="000000"/>
+          <w:shd w:val="clear" w:color="000000" w:fill="000000"/>
+          <w:lang w:val="x-none" w:eastAsia="x-none" w:bidi="x-none"/>
+        </w:rPr>
+      </w:pPr>
+    </w:p>
+    <w:p>
+      <w:pPr>
+        <w:spacing w:after="0"/>
+        <w:rPr>
+          <w:rStyle w:val="Normal"/>
+          <w:rFonts w:ascii="Times New Roman" w:eastAsia="Times New Roman" w:hAnsi="Times New Roman" w:cs="Times New Roman"/>
+          <w:snapToGrid w:val="0"/>
+          <w:w w:val="0"/>
+          <w:sz w:val="0"/>
+          <w:szCs w:val="0"/>
+          <w:u w:color="000000"/>
+          <w:bdr w:val="none" w:sz="0" w:space="0" w:color="000000"/>
+          <w:shd w:val="clear" w:color="000000" w:fill="000000"/>
+          <w:lang w:val="x-none" w:eastAsia="x-none" w:bidi="x-none"/>
+        </w:rPr>
+      </w:pPr>
+    </w:p>
+    <w:p>
+      <w:pPr>
+        <w:spacing w:after="0"/>
+        <w:rPr>
+          <w:rStyle w:val="Normal"/>
+          <w:rFonts w:ascii="Times New Roman" w:eastAsia="Times New Roman" w:hAnsi="Times New Roman" w:cs="Times New Roman"/>
+          <w:snapToGrid w:val="0"/>
+          <w:w w:val="0"/>
+          <w:sz w:val="0"/>
+          <w:szCs w:val="0"/>
+          <w:u w:color="000000"/>
+          <w:bdr w:val="none" w:sz="0" w:space="0" w:color="000000"/>
+          <w:shd w:val="clear" w:color="000000" w:fill="000000"/>
+          <w:lang w:val="x-none" w:eastAsia="x-none" w:bidi="x-none"/>
+        </w:rPr>
+      </w:pPr>
+    </w:p>
+    <w:p>
+      <w:pPr>
+        <w:spacing w:after="0"/>
+        <w:rPr>
+          <w:rStyle w:val="Normal"/>
+          <w:rFonts w:ascii="Times New Roman" w:eastAsia="Times New Roman" w:hAnsi="Times New Roman" w:cs="Times New Roman"/>
+          <w:snapToGrid w:val="0"/>
+          <w:w w:val="0"/>
+          <w:sz w:val="0"/>
+          <w:szCs w:val="0"/>
+          <w:u w:color="000000"/>
+          <w:bdr w:val="none" w:sz="0" w:space="0" w:color="000000"/>
+          <w:shd w:val="clear" w:color="000000" w:fill="000000"/>
+          <w:lang w:val="x-none" w:eastAsia="x-none" w:bidi="x-none"/>
+        </w:rPr>
+      </w:pPr>
+    </w:p>
+    <w:p>
+      <w:pPr>
+        <w:spacing w:after="0"/>
+        <w:rPr>
+          <w:rStyle w:val="Normal"/>
+          <w:rFonts w:ascii="Times New Roman" w:eastAsia="Times New Roman" w:hAnsi="Times New Roman" w:cs="Times New Roman"/>
+          <w:snapToGrid w:val="0"/>
+          <w:w w:val="0"/>
+          <w:sz w:val="0"/>
+          <w:szCs w:val="0"/>
+          <w:u w:color="000000"/>
+          <w:bdr w:val="none" w:sz="0" w:space="0" w:color="000000"/>
+          <w:shd w:val="clear" w:color="000000" w:fill="000000"/>
+          <w:lang w:val="x-none" w:eastAsia="x-none" w:bidi="x-none"/>
+        </w:rPr>
+      </w:pPr>
+    </w:p>
+    <w:p>
+      <w:pPr>
+        <w:spacing w:after="0"/>
+        <w:rPr>
+          <w:rStyle w:val="Normal"/>
+          <w:rFonts w:ascii="Times New Roman" w:eastAsia="Times New Roman" w:hAnsi="Times New Roman" w:cs="Times New Roman"/>
+          <w:snapToGrid w:val="0"/>
+          <w:w w:val="0"/>
+          <w:sz w:val="0"/>
+          <w:szCs w:val="0"/>
+          <w:u w:color="000000"/>
+          <w:bdr w:val="none" w:sz="0" w:space="0" w:color="000000"/>
+          <w:shd w:val="clear" w:color="000000" w:fill="000000"/>
+          <w:lang w:val="x-none" w:eastAsia="x-none" w:bidi="x-none"/>
+        </w:rPr>
+      </w:pPr>
+    </w:p>
+    <w:p>
+      <w:pPr>
+        <w:spacing w:after="0"/>
+        <w:rPr>
+          <w:rStyle w:val="Normal"/>
+          <w:rFonts w:ascii="Times New Roman" w:eastAsia="Times New Roman" w:hAnsi="Times New Roman" w:cs="Times New Roman"/>
+          <w:snapToGrid w:val="0"/>
+          <w:w w:val="0"/>
+          <w:sz w:val="0"/>
+          <w:szCs w:val="0"/>
+          <w:u w:color="000000"/>
+          <w:bdr w:val="none" w:sz="0" w:space="0" w:color="000000"/>
+          <w:shd w:val="clear" w:color="000000" w:fill="000000"/>
+          <w:lang w:val="x-none" w:eastAsia="x-none" w:bidi="x-none"/>
+        </w:rPr>
+      </w:pPr>
+    </w:p>
+    <w:p>
+      <w:pPr>
+        <w:spacing w:after="0"/>
+        <w:rPr>
+          <w:rStyle w:val="Normal"/>
+          <w:rFonts w:ascii="Times New Roman" w:eastAsia="Times New Roman" w:hAnsi="Times New Roman" w:cs="Times New Roman"/>
+          <w:snapToGrid w:val="0"/>
+          <w:w w:val="0"/>
+          <w:sz w:val="0"/>
+          <w:szCs w:val="0"/>
+          <w:u w:color="000000"/>
+          <w:bdr w:val="none" w:sz="0" w:space="0" w:color="000000"/>
+          <w:shd w:val="clear" w:color="000000" w:fill="000000"/>
+          <w:lang w:val="x-none" w:eastAsia="x-none" w:bidi="x-none"/>
+        </w:rPr>
+      </w:pPr>
+    </w:p>
+    <w:p>
+      <w:pPr>
+        <w:spacing w:after="0"/>
+        <w:rPr>
+          <w:rStyle w:val="Normal"/>
+          <w:rFonts w:ascii="Times New Roman" w:eastAsia="Times New Roman" w:hAnsi="Times New Roman" w:cs="Times New Roman"/>
+          <w:snapToGrid w:val="0"/>
+          <w:w w:val="0"/>
+          <w:sz w:val="0"/>
+          <w:szCs w:val="0"/>
+          <w:u w:color="000000"/>
+          <w:bdr w:val="none" w:sz="0" w:space="0" w:color="000000"/>
+          <w:shd w:val="clear" w:color="000000" w:fill="000000"/>
+          <w:lang w:val="x-none" w:eastAsia="x-none" w:bidi="x-none"/>
+        </w:rPr>
+      </w:pPr>
+    </w:p>
+    <w:p>
+      <w:pPr>
+        <w:spacing w:after="0"/>
+        <w:rPr>
+          <w:rStyle w:val="Normal"/>
+          <w:rFonts w:ascii="Times New Roman" w:eastAsia="Times New Roman" w:hAnsi="Times New Roman" w:cs="Times New Roman"/>
+          <w:snapToGrid w:val="0"/>
+          <w:w w:val="0"/>
+          <w:sz w:val="0"/>
+          <w:szCs w:val="0"/>
+          <w:u w:color="000000"/>
+          <w:bdr w:val="none" w:sz="0" w:space="0" w:color="000000"/>
+          <w:shd w:val="clear" w:color="000000" w:fill="000000"/>
+          <w:lang w:val="x-none" w:eastAsia="x-none" w:bidi="x-none"/>
+        </w:rPr>
+      </w:pPr>
+    </w:p>
+    <w:p>
+      <w:pPr>
+        <w:spacing w:after="0"/>
+        <w:rPr>
+          <w:rStyle w:val="Normal"/>
+          <w:rFonts w:ascii="Times New Roman" w:eastAsia="Times New Roman" w:hAnsi="Times New Roman" w:cs="Times New Roman"/>
+          <w:snapToGrid w:val="0"/>
+          <w:w w:val="0"/>
+          <w:sz w:val="0"/>
+          <w:szCs w:val="0"/>
+          <w:u w:color="000000"/>
+          <w:bdr w:val="none" w:sz="0" w:space="0" w:color="000000"/>
+          <w:shd w:val="clear" w:color="000000" w:fill="000000"/>
+          <w:lang w:val="x-none" w:eastAsia="x-none" w:bidi="x-none"/>
+        </w:rPr>
+      </w:pPr>
+    </w:p>
+    <w:p>
+      <w:pPr>
+        <w:spacing w:after="0"/>
+        <w:rPr>
+          <w:rStyle w:val="Normal"/>
+          <w:rFonts w:ascii="Times New Roman" w:eastAsia="Times New Roman" w:hAnsi="Times New Roman" w:cs="Times New Roman"/>
+          <w:snapToGrid w:val="0"/>
+          <w:w w:val="0"/>
+          <w:sz w:val="0"/>
+          <w:szCs w:val="0"/>
+          <w:u w:color="000000"/>
+          <w:bdr w:val="none" w:sz="0" w:space="0" w:color="000000"/>
+          <w:shd w:val="clear" w:color="000000" w:fill="000000"/>
+          <w:lang w:val="x-none" w:eastAsia="x-none" w:bidi="x-none"/>
+        </w:rPr>
+      </w:pPr>
+    </w:p>
+    <w:p>
+      <w:pPr>
+        <w:spacing w:after="0"/>
+        <w:rPr>
+          <w:rStyle w:val="Normal"/>
+          <w:rFonts w:ascii="Times New Roman" w:eastAsia="Times New Roman" w:hAnsi="Times New Roman" w:cs="Times New Roman"/>
+          <w:snapToGrid w:val="0"/>
+          <w:w w:val="0"/>
+          <w:sz w:val="0"/>
+          <w:szCs w:val="0"/>
+          <w:u w:color="000000"/>
+          <w:bdr w:val="none" w:sz="0" w:space="0" w:color="000000"/>
+          <w:shd w:val="clear" w:color="000000" w:fill="000000"/>
+          <w:lang w:val="x-none" w:eastAsia="x-none" w:bidi="x-none"/>
+        </w:rPr>
+      </w:pPr>
+    </w:p>
+    <w:p>
+      <w:pPr>
+        <w:spacing w:after="0"/>
+        <w:rPr>
+          <w:rStyle w:val="Normal"/>
+          <w:rFonts w:ascii="Times New Roman" w:eastAsia="Times New Roman" w:hAnsi="Times New Roman" w:cs="Times New Roman"/>
+          <w:snapToGrid w:val="0"/>
+          <w:w w:val="0"/>
+          <w:sz w:val="0"/>
+          <w:szCs w:val="0"/>
+          <w:u w:color="000000"/>
+          <w:bdr w:val="none" w:sz="0" w:space="0" w:color="000000"/>
+          <w:shd w:val="clear" w:color="000000" w:fill="000000"/>
+          <w:lang w:val="x-none" w:eastAsia="x-none" w:bidi="x-none"/>
+        </w:rPr>
+      </w:pPr>
+    </w:p>
+    <w:p>
+      <w:pPr>
+        <w:spacing w:after="0"/>
+        <w:rPr>
+          <w:rStyle w:val="Normal"/>
+          <w:rFonts w:ascii="Times New Roman" w:eastAsia="Times New Roman" w:hAnsi="Times New Roman" w:cs="Times New Roman"/>
+          <w:snapToGrid w:val="0"/>
+          <w:w w:val="0"/>
+          <w:sz w:val="0"/>
+          <w:szCs w:val="0"/>
+          <w:u w:color="000000"/>
+          <w:bdr w:val="none" w:sz="0" w:space="0" w:color="000000"/>
+          <w:shd w:val="clear" w:color="000000" w:fill="000000"/>
+          <w:lang w:val="x-none" w:eastAsia="x-none" w:bidi="x-none"/>
+        </w:rPr>
+      </w:pPr>
+    </w:p>
+    <w:p>
+      <w:pPr>
+        <w:spacing w:after="0"/>
+        <w:rPr>
+          <w:rStyle w:val="Normal"/>
+          <w:rFonts w:ascii="Times New Roman" w:eastAsia="Times New Roman" w:hAnsi="Times New Roman" w:cs="Times New Roman"/>
+          <w:snapToGrid w:val="0"/>
+          <w:w w:val="0"/>
+          <w:sz w:val="0"/>
+          <w:szCs w:val="0"/>
+          <w:u w:color="000000"/>
+          <w:bdr w:val="none" w:sz="0" w:space="0" w:color="000000"/>
+          <w:shd w:val="clear" w:color="000000" w:fill="000000"/>
+          <w:lang w:val="x-none" w:eastAsia="x-none" w:bidi="x-none"/>
+        </w:rPr>
+      </w:pPr>
+    </w:p>
+    <w:p>
+      <w:pPr>
+        <w:spacing w:after="0"/>
+        <w:rPr>
+          <w:rStyle w:val="Normal"/>
+          <w:rFonts w:ascii="Times New Roman" w:eastAsia="Times New Roman" w:hAnsi="Times New Roman" w:cs="Times New Roman"/>
+          <w:snapToGrid w:val="0"/>
+          <w:w w:val="0"/>
+          <w:sz w:val="0"/>
+          <w:szCs w:val="0"/>
+          <w:u w:color="000000"/>
+          <w:bdr w:val="none" w:sz="0" w:space="0" w:color="000000"/>
+          <w:shd w:val="clear" w:color="000000" w:fill="000000"/>
+          <w:lang w:val="x-none" w:eastAsia="x-none" w:bidi="x-none"/>
+        </w:rPr>
+      </w:pPr>
+    </w:p>
+    <w:p>
+      <w:pPr>
+        <w:spacing w:after="0"/>
+        <w:rPr>
+          <w:rStyle w:val="Normal"/>
+          <w:rFonts w:ascii="Times New Roman" w:eastAsia="Times New Roman" w:hAnsi="Times New Roman" w:cs="Times New Roman"/>
+          <w:snapToGrid w:val="0"/>
+          <w:w w:val="0"/>
+          <w:sz w:val="0"/>
+          <w:szCs w:val="0"/>
+          <w:u w:color="000000"/>
+          <w:bdr w:val="none" w:sz="0" w:space="0" w:color="000000"/>
+          <w:shd w:val="clear" w:color="000000" w:fill="000000"/>
+          <w:lang w:val="x-none" w:eastAsia="x-none" w:bidi="x-none"/>
+        </w:rPr>
+      </w:pPr>
+    </w:p>
+    <w:p>
+      <w:pPr>
+        <w:spacing w:after="0"/>
+        <w:rPr>
+          <w:rStyle w:val="Normal"/>
+          <w:rFonts w:ascii="Times New Roman" w:eastAsia="Times New Roman" w:hAnsi="Times New Roman" w:cs="Times New Roman"/>
+          <w:snapToGrid w:val="0"/>
+          <w:w w:val="0"/>
+          <w:sz w:val="0"/>
+          <w:szCs w:val="0"/>
+          <w:u w:color="000000"/>
+          <w:bdr w:val="none" w:sz="0" w:space="0" w:color="000000"/>
+          <w:shd w:val="clear" w:color="000000" w:fill="000000"/>
+          <w:lang w:val="x-none" w:eastAsia="x-none" w:bidi="x-none"/>
+        </w:rPr>
+      </w:pPr>
+    </w:p>
+    <w:p>
+      <w:pPr>
+        <w:spacing w:after="0"/>
+        <w:rPr>
+          <w:rStyle w:val="Normal"/>
+          <w:rFonts w:ascii="Times New Roman" w:eastAsia="Times New Roman" w:hAnsi="Times New Roman" w:cs="Times New Roman"/>
+          <w:snapToGrid w:val="0"/>
+          <w:w w:val="0"/>
+          <w:sz w:val="0"/>
+          <w:szCs w:val="0"/>
+          <w:u w:color="000000"/>
+          <w:bdr w:val="none" w:sz="0" w:space="0" w:color="000000"/>
+          <w:shd w:val="clear" w:color="000000" w:fill="000000"/>
+          <w:lang w:val="x-none" w:eastAsia="x-none" w:bidi="x-none"/>
+        </w:rPr>
+      </w:pPr>
+    </w:p>
+    <w:p>
+      <w:pPr>
+        <w:spacing w:after="0"/>
+        <w:rPr>
+          <w:rStyle w:val="Normal"/>
+          <w:rFonts w:ascii="Times New Roman" w:eastAsia="Times New Roman" w:hAnsi="Times New Roman" w:cs="Times New Roman"/>
+          <w:snapToGrid w:val="0"/>
+          <w:w w:val="0"/>
+          <w:sz w:val="0"/>
+          <w:szCs w:val="0"/>
+          <w:u w:color="000000"/>
+          <w:bdr w:val="none" w:sz="0" w:space="0" w:color="000000"/>
+          <w:shd w:val="clear" w:color="000000" w:fill="000000"/>
+          <w:lang w:val="x-none" w:eastAsia="x-none" w:bidi="x-none"/>
+        </w:rPr>
+      </w:pPr>
+    </w:p>
+    <w:p>
+      <w:pPr>
+        <w:spacing w:after="0"/>
+        <w:rPr>
+          <w:rStyle w:val="Normal"/>
+          <w:rFonts w:ascii="Times New Roman" w:eastAsia="Times New Roman" w:hAnsi="Times New Roman" w:cs="Times New Roman"/>
+          <w:snapToGrid w:val="0"/>
+          <w:w w:val="0"/>
+          <w:sz w:val="0"/>
+          <w:szCs w:val="0"/>
+          <w:u w:color="000000"/>
+          <w:bdr w:val="none" w:sz="0" w:space="0" w:color="000000"/>
+          <w:shd w:val="clear" w:color="000000" w:fill="000000"/>
+          <w:lang w:val="x-none" w:eastAsia="x-none" w:bidi="x-none"/>
+        </w:rPr>
+      </w:pPr>
+    </w:p>
+    <w:p>
+      <w:pPr>
+        <w:spacing w:after="0"/>
+        <w:rPr>
+          <w:rStyle w:val="Normal"/>
+          <w:rFonts w:ascii="Times New Roman" w:eastAsia="Times New Roman" w:hAnsi="Times New Roman" w:cs="Times New Roman"/>
+          <w:snapToGrid w:val="0"/>
+          <w:w w:val="0"/>
+          <w:sz w:val="0"/>
+          <w:szCs w:val="0"/>
+          <w:u w:color="000000"/>
+          <w:bdr w:val="none" w:sz="0" w:space="0" w:color="000000"/>
+          <w:shd w:val="clear" w:color="000000" w:fill="000000"/>
+          <w:lang w:val="x-none" w:eastAsia="x-none" w:bidi="x-none"/>
+        </w:rPr>
+      </w:pPr>
+    </w:p>
+    <w:p>
+      <w:pPr>
+        <w:spacing w:after="0"/>
+        <w:rPr>
+          <w:rStyle w:val="Normal"/>
+          <w:rFonts w:ascii="Times New Roman" w:eastAsia="Times New Roman" w:hAnsi="Times New Roman" w:cs="Times New Roman"/>
+          <w:snapToGrid w:val="0"/>
+          <w:w w:val="0"/>
+          <w:sz w:val="0"/>
+          <w:szCs w:val="0"/>
+          <w:u w:color="000000"/>
+          <w:bdr w:val="none" w:sz="0" w:space="0" w:color="000000"/>
+          <w:shd w:val="clear" w:color="000000" w:fill="000000"/>
+          <w:lang w:val="x-none" w:eastAsia="x-none" w:bidi="x-none"/>
+        </w:rPr>
+      </w:pPr>
+    </w:p>
+    <w:p>
+      <w:pPr>
+        <w:spacing w:after="0"/>
+        <w:rPr>
+          <w:rStyle w:val="Normal"/>
+          <w:rFonts w:ascii="Times New Roman" w:eastAsia="Times New Roman" w:hAnsi="Times New Roman" w:cs="Times New Roman"/>
+          <w:snapToGrid w:val="0"/>
+          <w:w w:val="0"/>
+          <w:sz w:val="0"/>
+          <w:szCs w:val="0"/>
+          <w:u w:color="000000"/>
+          <w:bdr w:val="none" w:sz="0" w:space="0" w:color="000000"/>
+          <w:shd w:val="clear" w:color="000000" w:fill="000000"/>
+          <w:lang w:val="x-none" w:eastAsia="x-none" w:bidi="x-none"/>
+        </w:rPr>
+      </w:pPr>
+    </w:p>
+    <w:p>
+      <w:pPr>
+        <w:spacing w:after="0"/>
+        <w:rPr>
+          <w:rStyle w:val="Normal"/>
+          <w:rFonts w:ascii="Times New Roman" w:eastAsia="Times New Roman" w:hAnsi="Times New Roman" w:cs="Times New Roman"/>
+          <w:snapToGrid w:val="0"/>
+          <w:w w:val="0"/>
+          <w:sz w:val="0"/>
+          <w:szCs w:val="0"/>
+          <w:u w:color="000000"/>
+          <w:bdr w:val="none" w:sz="0" w:space="0" w:color="000000"/>
+          <w:shd w:val="clear" w:color="000000" w:fill="000000"/>
+          <w:lang w:val="x-none" w:eastAsia="x-none" w:bidi="x-none"/>
+        </w:rPr>
+      </w:pPr>
+    </w:p>
+    <w:p>
+      <w:pPr>
+        <w:spacing w:after="0"/>
+        <w:rPr>
+          <w:rStyle w:val="Normal"/>
+          <w:rFonts w:ascii="Times New Roman" w:eastAsia="Times New Roman" w:hAnsi="Times New Roman" w:cs="Times New Roman"/>
+          <w:snapToGrid w:val="0"/>
+          <w:w w:val="0"/>
+          <w:sz w:val="0"/>
+          <w:szCs w:val="0"/>
+          <w:u w:color="000000"/>
+          <w:bdr w:val="none" w:sz="0" w:space="0" w:color="000000"/>
+          <w:shd w:val="clear" w:color="000000" w:fill="000000"/>
+          <w:lang w:val="x-none" w:eastAsia="x-none" w:bidi="x-none"/>
+        </w:rPr>
+      </w:pPr>
+    </w:p>
+    <w:p>
+      <w:pPr>
+        <w:spacing w:after="0"/>
+        <w:rPr>
+          <w:rStyle w:val="Normal"/>
+          <w:rFonts w:ascii="Times New Roman" w:eastAsia="Times New Roman" w:hAnsi="Times New Roman" w:cs="Times New Roman"/>
+          <w:snapToGrid w:val="0"/>
+          <w:w w:val="0"/>
+          <w:sz w:val="0"/>
+          <w:szCs w:val="0"/>
+          <w:u w:color="000000"/>
+          <w:bdr w:val="none" w:sz="0" w:space="0" w:color="000000"/>
+          <w:shd w:val="clear" w:color="000000" w:fill="000000"/>
+          <w:lang w:val="x-none" w:eastAsia="x-none" w:bidi="x-none"/>
+        </w:rPr>
+      </w:pPr>
+    </w:p>
+    <w:p>
+      <w:pPr>
+        <w:spacing w:after="0"/>
+        <w:rPr>
+          <w:rStyle w:val="Normal"/>
+          <w:rFonts w:ascii="Times New Roman" w:eastAsia="Times New Roman" w:hAnsi="Times New Roman" w:cs="Times New Roman"/>
+          <w:snapToGrid w:val="0"/>
+          <w:w w:val="0"/>
+          <w:sz w:val="0"/>
+          <w:szCs w:val="0"/>
+          <w:u w:color="000000"/>
+          <w:bdr w:val="none" w:sz="0" w:space="0" w:color="000000"/>
+          <w:shd w:val="clear" w:color="000000" w:fill="000000"/>
+          <w:lang w:val="x-none" w:eastAsia="x-none" w:bidi="x-none"/>
+        </w:rPr>
+      </w:pPr>
+    </w:p>
+    <w:p>
+      <w:pPr>
+        <w:spacing w:after="0"/>
+        <w:rPr>
+          <w:rStyle w:val="Normal"/>
+          <w:rFonts w:ascii="Times New Roman" w:eastAsia="Times New Roman" w:hAnsi="Times New Roman" w:cs="Times New Roman"/>
+          <w:snapToGrid w:val="0"/>
+          <w:w w:val="0"/>
+          <w:sz w:val="0"/>
+          <w:szCs w:val="0"/>
+          <w:u w:color="000000"/>
+          <w:bdr w:val="none" w:sz="0" w:space="0" w:color="000000"/>
+          <w:shd w:val="clear" w:color="000000" w:fill="000000"/>
+          <w:lang w:val="x-none" w:eastAsia="x-none" w:bidi="x-none"/>
+        </w:rPr>
+      </w:pPr>
+    </w:p>
+    <w:p>
+      <w:pPr>
+        <w:spacing w:after="0"/>
+        <w:rPr>
+          <w:rFonts w:ascii="Times New Roman" w:hAnsi="Times New Roman" w:cs="Times New Roman"/>
+        </w:rPr>
+      </w:pPr>
+      <w:r>
+        <w:rPr>
           <w:rFonts w:ascii="Times New Roman" w:eastAsia="Arial" w:hAnsi="Times New Roman" w:cs="Times New Roman"/>
-        </w:rPr>
-        <w:t xml:space="preserve">k6 output): </w:t>
+          <w:noProof/>
+          <w:sz w:val="5"/>
+        </w:rPr>
+        <w:lastRenderedPageBreak/>
+        <w:drawing>
+          <wp:inline distT="0" distB="0" distL="0" distR="0">
+            <wp:extent cx="6619875" cy="3316736"/>
+            <wp:effectExtent l="0" t="0" r="0" b="0"/>
+            <wp:docPr id="6" name="Picture 6" descr="D:\EduGenie\skill-wallet---GenAI-Project--main\images\Img6.jpeg"/>
+            <wp:cNvGraphicFramePr>
+              <a:graphicFrameLocks xmlns:a="http://schemas.openxmlformats.org/drawingml/2006/main" noChangeAspect="1"/>
+            </wp:cNvGraphicFramePr>
+            <a:graphic xmlns:a="http://schemas.openxmlformats.org/drawingml/2006/main">
+              <a:graphicData uri="http://schemas.openxmlformats.org/drawingml/2006/picture">
+                <pic:pic xmlns:pic="http://schemas.openxmlformats.org/drawingml/2006/picture">
+                  <pic:nvPicPr>
+                    <pic:cNvPr id="0" name="Picture 2" descr="D:\EduGenie\skill-wallet---GenAI-Project--main\images\Img6.jpeg"/>
+                    <pic:cNvPicPr>
+                      <a:picLocks noChangeAspect="1" noChangeArrowheads="1"/>
+                    </pic:cNvPicPr>
+                  </pic:nvPicPr>
+                  <pic:blipFill>
+                    <a:blip r:embed="rId9">
+                      <a:extLst>
+                        <a:ext uri="{28A0092B-C50C-407E-A947-70E740481C1C}">
+                          <a14:useLocalDpi xmlns:a14="http://schemas.microsoft.com/office/drawing/2010/main" val="0"/>
+                        </a:ext>
+                      </a:extLst>
+                    </a:blip>
+                    <a:srcRect/>
+                    <a:stretch>
+                      <a:fillRect/>
+                    </a:stretch>
+                  </pic:blipFill>
+                  <pic:spPr bwMode="auto">
+                    <a:xfrm>
+                      <a:off x="0" y="0"/>
+                      <a:ext cx="6619875" cy="3316736"/>
+                    </a:xfrm>
+                    <a:prstGeom prst="rect">
+                      <a:avLst/>
+                    </a:prstGeom>
+                    <a:noFill/>
+                    <a:ln>
+                      <a:noFill/>
+                    </a:ln>
+                  </pic:spPr>
+                </pic:pic>
+              </a:graphicData>
+            </a:graphic>
+          </wp:inline>
+        </w:drawing>
       </w:r>
     </w:p>
     <w:p>
       <w:pPr>
         <w:spacing w:after="0"/>
+        <w:rPr>
+          <w:rFonts w:ascii="Times New Roman" w:hAnsi="Times New Roman" w:cs="Times New Roman"/>
+        </w:rPr>
+      </w:pPr>
+    </w:p>
+    <w:p>
+      <w:pPr>
+        <w:spacing w:after="0"/>
+        <w:jc w:val="center"/>
         <w:rPr>
           <w:rFonts w:ascii="Times New Roman" w:hAnsi="Times New Roman" w:cs="Times New Roman"/>
         </w:rPr>
@@ -3673,39 +5100,47 @@
           <w:rFonts w:ascii="Times New Roman" w:eastAsia="Arial" w:hAnsi="Times New Roman" w:cs="Times New Roman"/>
           <w:sz w:val="5"/>
         </w:rPr>
-        <w:t xml:space="preserve"> </w:t>
+        <w:drawing>
+          <wp:inline distT="0" distB="0" distL="0" distR="0" wp14:anchorId="4D3620E1" wp14:editId="38F66596">
+            <wp:extent cx="2546481" cy="3416476"/>
+            <wp:effectExtent l="0" t="0" r="6350" b="0"/>
+            <wp:docPr id="10" name="Picture 10"/>
+            <wp:cNvGraphicFramePr>
+              <a:graphicFrameLocks xmlns:a="http://schemas.openxmlformats.org/drawingml/2006/main" noChangeAspect="1"/>
+            </wp:cNvGraphicFramePr>
+            <a:graphic xmlns:a="http://schemas.openxmlformats.org/drawingml/2006/main">
+              <a:graphicData uri="http://schemas.openxmlformats.org/drawingml/2006/picture">
+                <pic:pic xmlns:pic="http://schemas.openxmlformats.org/drawingml/2006/picture">
+                  <pic:nvPicPr>
+                    <pic:cNvPr id="1" name=""/>
+                    <pic:cNvPicPr/>
+                  </pic:nvPicPr>
+                  <pic:blipFill>
+                    <a:blip r:embed="rId10"/>
+                    <a:stretch>
+                      <a:fillRect/>
+                    </a:stretch>
+                  </pic:blipFill>
+                  <pic:spPr>
+                    <a:xfrm>
+                      <a:off x="0" y="0"/>
+                      <a:ext cx="2546481" cy="3416476"/>
+                    </a:xfrm>
+                    <a:prstGeom prst="rect">
+                      <a:avLst/>
+                    </a:prstGeom>
+                  </pic:spPr>
+                </pic:pic>
+              </a:graphicData>
+            </a:graphic>
+          </wp:inline>
+        </w:drawing>
       </w:r>
     </w:p>
-    <w:p>
-      <w:pPr>
-        <w:spacing w:after="0"/>
-        <w:rPr>
-          <w:rFonts w:ascii="Times New Roman" w:hAnsi="Times New Roman" w:cs="Times New Roman"/>
-        </w:rPr>
-      </w:pPr>
-      <w:bookmarkStart w:id="0" w:name="_GoBack"/>
-      <w:bookmarkEnd w:id="0"/>
-    </w:p>
-    <w:p>
-      <w:pPr>
-        <w:spacing w:after="0"/>
-        <w:jc w:val="right"/>
-        <w:rPr>
-          <w:rFonts w:ascii="Times New Roman" w:hAnsi="Times New Roman" w:cs="Times New Roman"/>
-        </w:rPr>
-      </w:pPr>
-      <w:r>
-        <w:rPr>
-          <w:rFonts w:ascii="Times New Roman" w:eastAsia="Arial" w:hAnsi="Times New Roman" w:cs="Times New Roman"/>
-          <w:sz w:val="5"/>
-        </w:rPr>
-        <w:t xml:space="preserve"> </w:t>
-      </w:r>
-    </w:p>
     <w:sectPr>
-      <w:headerReference w:type="even" r:id="rId7"/>
-      <w:headerReference w:type="default" r:id="rId8"/>
-      <w:headerReference w:type="first" r:id="rId9"/>
+      <w:headerReference w:type="even" r:id="rId11"/>
+      <w:headerReference w:type="default" r:id="rId12"/>
+      <w:headerReference w:type="first" r:id="rId13"/>
       <w:pgSz w:w="12240" w:h="15840"/>
       <w:pgMar w:top="1805" w:right="735" w:bottom="460" w:left="1080" w:header="90" w:footer="720" w:gutter="0"/>
       <w:cols w:space="720"/>

</xml_diff>